<commit_message>
la partie 2.1 terminus
</commit_message>
<xml_diff>
--- a/Maths/Moteur_RTS_exercices_2.docx
+++ b/Maths/Moteur_RTS_exercices_2.docx
@@ -269,13 +269,7 @@
         <w:rPr>
           <w:rFonts w:eastAsiaTheme="minorEastAsia"/>
         </w:rPr>
-        <w:t xml:space="preserve"> et </w:t>
-      </w:r>
-      <w:r>
-        <w:rPr>
-          <w:rFonts w:eastAsiaTheme="minorEastAsia"/>
-        </w:rPr>
-        <w:t xml:space="preserve">pour </w:t>
+        <w:t xml:space="preserve"> et pour </w:t>
       </w:r>
       <m:oMath>
         <m:sSub>
@@ -300,13 +294,7 @@
               <w:rPr>
                 <w:rFonts w:ascii="Cambria Math" w:eastAsiaTheme="minorEastAsia" w:hAnsi="Cambria Math"/>
               </w:rPr>
-              <m:t>n</m:t>
-            </m:r>
-            <m:r>
-              <w:rPr>
-                <w:rFonts w:ascii="Cambria Math" w:eastAsiaTheme="minorEastAsia" w:hAnsi="Cambria Math"/>
-              </w:rPr>
-              <m:t>+1</m:t>
+              <m:t>n+1</m:t>
             </m:r>
           </m:sub>
         </m:sSub>
@@ -314,13 +302,7 @@
           <w:rPr>
             <w:rFonts w:ascii="Cambria Math" w:eastAsiaTheme="minorEastAsia" w:hAnsi="Cambria Math"/>
           </w:rPr>
-          <m:t>=</m:t>
-        </m:r>
-        <m:r>
-          <w:rPr>
-            <w:rFonts w:ascii="Cambria Math" w:eastAsiaTheme="minorEastAsia" w:hAnsi="Cambria Math"/>
-          </w:rPr>
-          <m:t>3</m:t>
+          <m:t>=3</m:t>
         </m:r>
       </m:oMath>
       <w:r>
@@ -352,13 +334,7 @@
               <w:rPr>
                 <w:rFonts w:ascii="Cambria Math" w:eastAsiaTheme="minorEastAsia" w:hAnsi="Cambria Math"/>
               </w:rPr>
-              <m:t>n</m:t>
-            </m:r>
-            <m:r>
-              <w:rPr>
-                <w:rFonts w:ascii="Cambria Math" w:eastAsiaTheme="minorEastAsia" w:hAnsi="Cambria Math"/>
-              </w:rPr>
-              <m:t>+1</m:t>
+              <m:t>n+1</m:t>
             </m:r>
           </m:sub>
         </m:sSub>
@@ -588,13 +564,7 @@
         <w:rPr>
           <w:rFonts w:eastAsiaTheme="minorEastAsia"/>
         </w:rPr>
-        <w:t xml:space="preserve"> </w:t>
-      </w:r>
-      <w:r>
-        <w:rPr>
-          <w:rFonts w:eastAsiaTheme="minorEastAsia"/>
-        </w:rPr>
-        <w:t xml:space="preserve">et pour tester on peux faire </w:t>
+        <w:t xml:space="preserve"> et pour tester on peux faire </w:t>
       </w:r>
       <m:oMath>
         <m:f>
@@ -629,13 +599,7 @@
                   <w:rPr>
                     <w:rFonts w:ascii="Cambria Math" w:hAnsi="Cambria Math"/>
                   </w:rPr>
-                  <m:t>n+</m:t>
-                </m:r>
-                <m:r>
-                  <w:rPr>
-                    <w:rFonts w:ascii="Cambria Math" w:hAnsi="Cambria Math"/>
-                  </w:rPr>
-                  <m:t>2</m:t>
+                  <m:t>n+2</m:t>
                 </m:r>
               </m:sub>
             </m:sSub>
@@ -667,13 +631,7 @@
                   <w:rPr>
                     <w:rFonts w:ascii="Cambria Math" w:hAnsi="Cambria Math"/>
                   </w:rPr>
-                  <m:t>n</m:t>
-                </m:r>
-                <m:r>
-                  <w:rPr>
-                    <w:rFonts w:ascii="Cambria Math" w:hAnsi="Cambria Math"/>
-                  </w:rPr>
-                  <m:t>+1</m:t>
+                  <m:t>n+1</m:t>
                 </m:r>
               </m:sub>
             </m:sSub>
@@ -701,13 +659,7 @@
                   <w:rPr>
                     <w:rFonts w:ascii="Cambria Math" w:hAnsi="Cambria Math"/>
                   </w:rPr>
-                  <m:t>n+</m:t>
-                </m:r>
-                <m:r>
-                  <w:rPr>
-                    <w:rFonts w:ascii="Cambria Math" w:hAnsi="Cambria Math"/>
-                  </w:rPr>
-                  <m:t>2</m:t>
+                  <m:t>n+2</m:t>
                 </m:r>
               </m:sub>
             </m:sSub>
@@ -739,13 +691,7 @@
                   <w:rPr>
                     <w:rFonts w:ascii="Cambria Math" w:hAnsi="Cambria Math"/>
                   </w:rPr>
-                  <m:t>n</m:t>
-                </m:r>
-                <m:r>
-                  <w:rPr>
-                    <w:rFonts w:ascii="Cambria Math" w:hAnsi="Cambria Math"/>
-                  </w:rPr>
-                  <m:t>+1</m:t>
+                  <m:t>n+1</m:t>
                 </m:r>
               </m:sub>
             </m:sSub>
@@ -781,13 +727,7 @@
               <w:rPr>
                 <w:rFonts w:ascii="Cambria Math" w:eastAsiaTheme="minorEastAsia" w:hAnsi="Cambria Math"/>
               </w:rPr>
-              <m:t>n+</m:t>
-            </m:r>
-            <m:r>
-              <w:rPr>
-                <w:rFonts w:ascii="Cambria Math" w:eastAsiaTheme="minorEastAsia" w:hAnsi="Cambria Math"/>
-              </w:rPr>
-              <m:t>2</m:t>
+              <m:t>n+2</m:t>
             </m:r>
           </m:sub>
         </m:sSub>
@@ -795,13 +735,7 @@
           <w:rPr>
             <w:rFonts w:ascii="Cambria Math" w:eastAsiaTheme="minorEastAsia" w:hAnsi="Cambria Math"/>
           </w:rPr>
-          <m:t>=</m:t>
-        </m:r>
-        <m:r>
-          <w:rPr>
-            <w:rFonts w:ascii="Cambria Math" w:eastAsiaTheme="minorEastAsia" w:hAnsi="Cambria Math"/>
-          </w:rPr>
-          <m:t>4</m:t>
+          <m:t>=4</m:t>
         </m:r>
       </m:oMath>
       <w:r>
@@ -833,13 +767,7 @@
               <w:rPr>
                 <w:rFonts w:ascii="Cambria Math" w:eastAsiaTheme="minorEastAsia" w:hAnsi="Cambria Math"/>
               </w:rPr>
-              <m:t>n+</m:t>
-            </m:r>
-            <m:r>
-              <w:rPr>
-                <w:rFonts w:ascii="Cambria Math" w:eastAsiaTheme="minorEastAsia" w:hAnsi="Cambria Math"/>
-              </w:rPr>
-              <m:t>2</m:t>
+              <m:t>n+2</m:t>
             </m:r>
           </m:sub>
         </m:sSub>
@@ -889,13 +817,7 @@
                   <w:rPr>
                     <w:rFonts w:ascii="Cambria Math" w:hAnsi="Cambria Math"/>
                   </w:rPr>
-                  <m:t>n+</m:t>
-                </m:r>
-                <m:r>
-                  <w:rPr>
-                    <w:rFonts w:ascii="Cambria Math" w:hAnsi="Cambria Math"/>
-                  </w:rPr>
-                  <m:t>2</m:t>
+                  <m:t>n+2</m:t>
                 </m:r>
               </m:sub>
             </m:sSub>
@@ -927,13 +849,7 @@
                   <w:rPr>
                     <w:rFonts w:ascii="Cambria Math" w:hAnsi="Cambria Math"/>
                   </w:rPr>
-                  <m:t>n</m:t>
-                </m:r>
-                <m:r>
-                  <w:rPr>
-                    <w:rFonts w:ascii="Cambria Math" w:hAnsi="Cambria Math"/>
-                  </w:rPr>
-                  <m:t>+1</m:t>
+                  <m:t>n+1</m:t>
                 </m:r>
               </m:sub>
             </m:sSub>
@@ -961,13 +877,7 @@
                   <w:rPr>
                     <w:rFonts w:ascii="Cambria Math" w:hAnsi="Cambria Math"/>
                   </w:rPr>
-                  <m:t>n+</m:t>
-                </m:r>
-                <m:r>
-                  <w:rPr>
-                    <w:rFonts w:ascii="Cambria Math" w:hAnsi="Cambria Math"/>
-                  </w:rPr>
-                  <m:t>2</m:t>
+                  <m:t>n+2</m:t>
                 </m:r>
               </m:sub>
             </m:sSub>
@@ -999,13 +909,7 @@
                   <w:rPr>
                     <w:rFonts w:ascii="Cambria Math" w:hAnsi="Cambria Math"/>
                   </w:rPr>
-                  <m:t>n</m:t>
-                </m:r>
-                <m:r>
-                  <w:rPr>
-                    <w:rFonts w:ascii="Cambria Math" w:hAnsi="Cambria Math"/>
-                  </w:rPr>
-                  <m:t>+1</m:t>
+                  <m:t>n+1</m:t>
                 </m:r>
               </m:sub>
             </m:sSub>
@@ -1031,19 +935,7 @@
               <w:rPr>
                 <w:rFonts w:ascii="Cambria Math" w:hAnsi="Cambria Math"/>
               </w:rPr>
-              <m:t>3</m:t>
-            </m:r>
-            <m:r>
-              <w:rPr>
-                <w:rFonts w:ascii="Cambria Math" w:hAnsi="Cambria Math"/>
-              </w:rPr>
-              <m:t>-</m:t>
-            </m:r>
-            <m:r>
-              <w:rPr>
-                <w:rFonts w:ascii="Cambria Math" w:hAnsi="Cambria Math"/>
-              </w:rPr>
-              <m:t>2</m:t>
+              <m:t>3-2</m:t>
             </m:r>
           </m:num>
           <m:den>
@@ -1051,19 +943,7 @@
               <w:rPr>
                 <w:rFonts w:ascii="Cambria Math" w:hAnsi="Cambria Math"/>
               </w:rPr>
-              <m:t>4</m:t>
-            </m:r>
-            <m:r>
-              <w:rPr>
-                <w:rFonts w:ascii="Cambria Math" w:hAnsi="Cambria Math"/>
-              </w:rPr>
-              <m:t>-</m:t>
-            </m:r>
-            <m:r>
-              <w:rPr>
-                <w:rFonts w:ascii="Cambria Math" w:hAnsi="Cambria Math"/>
-              </w:rPr>
-              <m:t>3</m:t>
+              <m:t>4-3</m:t>
             </m:r>
           </m:den>
         </m:f>
@@ -1157,13 +1037,7 @@
         <w:rPr>
           <w:rFonts w:eastAsiaTheme="minorEastAsia"/>
         </w:rPr>
-        <w:t xml:space="preserve"> comme on a vue précédemment que </w:t>
-      </w:r>
-      <w:r>
-        <w:rPr>
-          <w:rFonts w:eastAsiaTheme="minorEastAsia"/>
-        </w:rPr>
-        <w:t xml:space="preserve"> </w:t>
+        <w:t xml:space="preserve"> comme on a vue précédemment que  </w:t>
       </w:r>
       <m:oMath>
         <m:f>
@@ -1249,20 +1123,26 @@
           <w:rPr>
             <w:rFonts w:ascii="Cambria Math" w:eastAsiaTheme="minorEastAsia" w:hAnsi="Cambria Math"/>
           </w:rPr>
-          <m:t>(2t)</m:t>
-        </m:r>
-        <m:r>
-          <w:rPr>
-            <w:rFonts w:ascii="Cambria Math" w:eastAsiaTheme="minorEastAsia" w:hAnsi="Cambria Math"/>
-          </w:rPr>
-          <m:t>=2</m:t>
+          <m:t>(2t)=2</m:t>
         </m:r>
       </m:oMath>
       <w:r>
         <w:rPr>
           <w:rFonts w:eastAsiaTheme="minorEastAsia"/>
         </w:rPr>
-        <w:t xml:space="preserve"> alors on a </w:t>
+        <w:t xml:space="preserve"> </w:t>
+      </w:r>
+      <w:r>
+        <w:rPr>
+          <w:rFonts w:eastAsiaTheme="minorEastAsia"/>
+        </w:rPr>
+        <w:t>Alors</w:t>
+      </w:r>
+      <w:r>
+        <w:rPr>
+          <w:rFonts w:eastAsiaTheme="minorEastAsia"/>
+        </w:rPr>
+        <w:t xml:space="preserve"> on a </w:t>
       </w:r>
       <m:oMath>
         <m:r>
@@ -1296,6 +1176,1785 @@
           <m:t>=2t+C</m:t>
         </m:r>
       </m:oMath>
+      <w:r>
+        <w:rPr>
+          <w:rFonts w:eastAsiaTheme="minorEastAsia"/>
+        </w:rPr>
+        <w:t xml:space="preserve"> et comme on a </w:t>
+      </w:r>
+      <m:oMath>
+        <m:r>
+          <w:rPr>
+            <w:rFonts w:ascii="Cambria Math" w:eastAsiaTheme="minorEastAsia" w:hAnsi="Cambria Math"/>
+          </w:rPr>
+          <m:t>P</m:t>
+        </m:r>
+        <m:d>
+          <m:dPr>
+            <m:ctrlPr>
+              <w:rPr>
+                <w:rFonts w:ascii="Cambria Math" w:eastAsiaTheme="minorEastAsia" w:hAnsi="Cambria Math"/>
+                <w:i/>
+              </w:rPr>
+            </m:ctrlPr>
+          </m:dPr>
+          <m:e>
+            <m:r>
+              <w:rPr>
+                <w:rFonts w:ascii="Cambria Math" w:eastAsiaTheme="minorEastAsia" w:hAnsi="Cambria Math"/>
+              </w:rPr>
+              <m:t>0</m:t>
+            </m:r>
+          </m:e>
+        </m:d>
+        <m:r>
+          <w:rPr>
+            <w:rFonts w:ascii="Cambria Math" w:eastAsiaTheme="minorEastAsia" w:hAnsi="Cambria Math"/>
+          </w:rPr>
+          <m:t>=0</m:t>
+        </m:r>
+      </m:oMath>
+      <w:r>
+        <w:rPr>
+          <w:rFonts w:eastAsiaTheme="minorEastAsia"/>
+        </w:rPr>
+        <w:t xml:space="preserve"> alors on a </w:t>
+      </w:r>
+    </w:p>
+    <w:p>
+      <w:pPr>
+        <w:rPr>
+          <w:rFonts w:eastAsiaTheme="minorEastAsia"/>
+        </w:rPr>
+      </w:pPr>
+      <w:r>
+        <w:rPr>
+          <w:rFonts w:eastAsiaTheme="minorEastAsia"/>
+        </w:rPr>
+        <w:t xml:space="preserve"> </w:t>
+      </w:r>
+      <m:oMath>
+        <m:r>
+          <w:rPr>
+            <w:rFonts w:ascii="Cambria Math" w:eastAsiaTheme="minorEastAsia" w:hAnsi="Cambria Math"/>
+          </w:rPr>
+          <m:t>C=0</m:t>
+        </m:r>
+      </m:oMath>
+      <w:r>
+        <w:rPr>
+          <w:rFonts w:eastAsiaTheme="minorEastAsia"/>
+        </w:rPr>
+        <w:t xml:space="preserve"> Donc finalement on a </w:t>
+      </w:r>
+      <m:oMath>
+        <m:r>
+          <w:rPr>
+            <w:rFonts w:ascii="Cambria Math" w:eastAsiaTheme="minorEastAsia" w:hAnsi="Cambria Math"/>
+          </w:rPr>
+          <m:t>P</m:t>
+        </m:r>
+        <m:d>
+          <m:dPr>
+            <m:ctrlPr>
+              <w:rPr>
+                <w:rFonts w:ascii="Cambria Math" w:eastAsiaTheme="minorEastAsia" w:hAnsi="Cambria Math"/>
+                <w:i/>
+              </w:rPr>
+            </m:ctrlPr>
+          </m:dPr>
+          <m:e>
+            <m:r>
+              <w:rPr>
+                <w:rFonts w:ascii="Cambria Math" w:eastAsiaTheme="minorEastAsia" w:hAnsi="Cambria Math"/>
+              </w:rPr>
+              <m:t>t</m:t>
+            </m:r>
+          </m:e>
+        </m:d>
+        <m:r>
+          <w:rPr>
+            <w:rFonts w:ascii="Cambria Math" w:eastAsiaTheme="minorEastAsia" w:hAnsi="Cambria Math"/>
+          </w:rPr>
+          <m:t>=2t</m:t>
+        </m:r>
+      </m:oMath>
+      <w:r>
+        <w:rPr>
+          <w:rFonts w:eastAsiaTheme="minorEastAsia"/>
+        </w:rPr>
+        <w:t xml:space="preserve"> la population augmente de 2 par unité de temp</w:t>
+      </w:r>
+    </w:p>
+    <w:p>
+      <w:pPr>
+        <w:rPr>
+          <w:rFonts w:eastAsiaTheme="minorEastAsia"/>
+        </w:rPr>
+      </w:pPr>
+    </w:p>
+    <w:p>
+      <w:pPr>
+        <w:rPr>
+          <w:rFonts w:eastAsiaTheme="minorEastAsia"/>
+        </w:rPr>
+      </w:pPr>
+      <w:r>
+        <w:rPr>
+          <w:rFonts w:eastAsiaTheme="minorEastAsia"/>
+        </w:rPr>
+        <w:t xml:space="preserve">3) </w:t>
+      </w:r>
+      <w:r>
+        <w:rPr>
+          <w:rFonts w:eastAsiaTheme="minorEastAsia"/>
+        </w:rPr>
+        <w:t xml:space="preserve">On a </w:t>
+      </w:r>
+      <m:oMath>
+        <m:f>
+          <m:fPr>
+            <m:ctrlPr>
+              <w:rPr>
+                <w:rFonts w:ascii="Cambria Math" w:hAnsi="Cambria Math"/>
+                <w:i/>
+              </w:rPr>
+            </m:ctrlPr>
+          </m:fPr>
+          <m:num>
+            <m:r>
+              <w:rPr>
+                <w:rFonts w:ascii="Cambria Math" w:hAnsi="Cambria Math"/>
+              </w:rPr>
+              <m:t>dP</m:t>
+            </m:r>
+          </m:num>
+          <m:den>
+            <m:r>
+              <w:rPr>
+                <w:rFonts w:ascii="Cambria Math" w:hAnsi="Cambria Math"/>
+              </w:rPr>
+              <m:t>dt</m:t>
+            </m:r>
+          </m:den>
+        </m:f>
+        <m:r>
+          <w:rPr>
+            <w:rFonts w:ascii="Cambria Math" w:hAnsi="Cambria Math"/>
+          </w:rPr>
+          <m:t xml:space="preserve"> ≈</m:t>
+        </m:r>
+        <m:f>
+          <m:fPr>
+            <m:ctrlPr>
+              <w:rPr>
+                <w:rFonts w:ascii="Cambria Math" w:hAnsi="Cambria Math"/>
+                <w:i/>
+              </w:rPr>
+            </m:ctrlPr>
+          </m:fPr>
+          <m:num>
+            <m:sSub>
+              <m:sSubPr>
+                <m:ctrlPr>
+                  <w:rPr>
+                    <w:rFonts w:ascii="Cambria Math" w:hAnsi="Cambria Math"/>
+                    <w:i/>
+                  </w:rPr>
+                </m:ctrlPr>
+              </m:sSubPr>
+              <m:e>
+                <m:r>
+                  <w:rPr>
+                    <w:rFonts w:ascii="Cambria Math" w:hAnsi="Cambria Math"/>
+                  </w:rPr>
+                  <m:t>P</m:t>
+                </m:r>
+              </m:e>
+              <m:sub>
+                <m:r>
+                  <w:rPr>
+                    <w:rFonts w:ascii="Cambria Math" w:hAnsi="Cambria Math"/>
+                  </w:rPr>
+                  <m:t>n+1</m:t>
+                </m:r>
+              </m:sub>
+            </m:sSub>
+            <m:r>
+              <w:rPr>
+                <w:rFonts w:ascii="Cambria Math" w:hAnsi="Cambria Math"/>
+              </w:rPr>
+              <m:t>-</m:t>
+            </m:r>
+            <m:sSub>
+              <m:sSubPr>
+                <m:ctrlPr>
+                  <w:rPr>
+                    <w:rFonts w:ascii="Cambria Math" w:hAnsi="Cambria Math"/>
+                    <w:i/>
+                  </w:rPr>
+                </m:ctrlPr>
+              </m:sSubPr>
+              <m:e>
+                <m:r>
+                  <w:rPr>
+                    <w:rFonts w:ascii="Cambria Math" w:hAnsi="Cambria Math"/>
+                  </w:rPr>
+                  <m:t>P</m:t>
+                </m:r>
+              </m:e>
+              <m:sub>
+                <m:r>
+                  <w:rPr>
+                    <w:rFonts w:ascii="Cambria Math" w:hAnsi="Cambria Math"/>
+                  </w:rPr>
+                  <m:t>n</m:t>
+                </m:r>
+              </m:sub>
+            </m:sSub>
+          </m:num>
+          <m:den>
+            <m:sSub>
+              <m:sSubPr>
+                <m:ctrlPr>
+                  <w:rPr>
+                    <w:rFonts w:ascii="Cambria Math" w:hAnsi="Cambria Math"/>
+                    <w:i/>
+                  </w:rPr>
+                </m:ctrlPr>
+              </m:sSubPr>
+              <m:e>
+                <m:r>
+                  <w:rPr>
+                    <w:rFonts w:ascii="Cambria Math" w:hAnsi="Cambria Math"/>
+                  </w:rPr>
+                  <m:t>t</m:t>
+                </m:r>
+              </m:e>
+              <m:sub>
+                <m:r>
+                  <w:rPr>
+                    <w:rFonts w:ascii="Cambria Math" w:hAnsi="Cambria Math"/>
+                  </w:rPr>
+                  <m:t>n+1</m:t>
+                </m:r>
+              </m:sub>
+            </m:sSub>
+            <m:r>
+              <w:rPr>
+                <w:rFonts w:ascii="Cambria Math" w:hAnsi="Cambria Math"/>
+              </w:rPr>
+              <m:t>-</m:t>
+            </m:r>
+            <m:sSub>
+              <m:sSubPr>
+                <m:ctrlPr>
+                  <w:rPr>
+                    <w:rFonts w:ascii="Cambria Math" w:hAnsi="Cambria Math"/>
+                    <w:i/>
+                  </w:rPr>
+                </m:ctrlPr>
+              </m:sSubPr>
+              <m:e>
+                <m:r>
+                  <w:rPr>
+                    <w:rFonts w:ascii="Cambria Math" w:hAnsi="Cambria Math"/>
+                  </w:rPr>
+                  <m:t>t</m:t>
+                </m:r>
+              </m:e>
+              <m:sub>
+                <m:r>
+                  <w:rPr>
+                    <w:rFonts w:ascii="Cambria Math" w:hAnsi="Cambria Math"/>
+                  </w:rPr>
+                  <m:t>n</m:t>
+                </m:r>
+              </m:sub>
+            </m:sSub>
+          </m:den>
+        </m:f>
+      </m:oMath>
+      <w:r>
+        <w:rPr>
+          <w:rFonts w:eastAsiaTheme="minorEastAsia"/>
+        </w:rPr>
+        <w:t xml:space="preserve"> mais on remplace </w:t>
+      </w:r>
+      <m:oMath>
+        <m:f>
+          <m:fPr>
+            <m:ctrlPr>
+              <w:rPr>
+                <w:rFonts w:ascii="Cambria Math" w:hAnsi="Cambria Math"/>
+                <w:i/>
+              </w:rPr>
+            </m:ctrlPr>
+          </m:fPr>
+          <m:num>
+            <m:r>
+              <w:rPr>
+                <w:rFonts w:ascii="Cambria Math" w:hAnsi="Cambria Math"/>
+              </w:rPr>
+              <m:t>dP</m:t>
+            </m:r>
+          </m:num>
+          <m:den>
+            <m:r>
+              <w:rPr>
+                <w:rFonts w:ascii="Cambria Math" w:hAnsi="Cambria Math"/>
+              </w:rPr>
+              <m:t>dt</m:t>
+            </m:r>
+          </m:den>
+        </m:f>
+        <m:r>
+          <w:rPr>
+            <w:rFonts w:ascii="Cambria Math" w:hAnsi="Cambria Math"/>
+          </w:rPr>
+          <m:t>=2</m:t>
+        </m:r>
+      </m:oMath>
+      <w:r>
+        <w:rPr>
+          <w:rFonts w:eastAsiaTheme="minorEastAsia"/>
+        </w:rPr>
+        <w:t xml:space="preserve"> et </w:t>
+      </w:r>
+      <m:oMath>
+        <m:sSub>
+          <m:sSubPr>
+            <m:ctrlPr>
+              <w:rPr>
+                <w:rFonts w:ascii="Cambria Math" w:hAnsi="Cambria Math"/>
+                <w:i/>
+              </w:rPr>
+            </m:ctrlPr>
+          </m:sSubPr>
+          <m:e>
+            <m:r>
+              <w:rPr>
+                <w:rFonts w:ascii="Cambria Math" w:hAnsi="Cambria Math"/>
+              </w:rPr>
+              <m:t>t</m:t>
+            </m:r>
+          </m:e>
+          <m:sub>
+            <m:r>
+              <w:rPr>
+                <w:rFonts w:ascii="Cambria Math" w:hAnsi="Cambria Math"/>
+              </w:rPr>
+              <m:t>n+1</m:t>
+            </m:r>
+          </m:sub>
+        </m:sSub>
+        <m:r>
+          <w:rPr>
+            <w:rFonts w:ascii="Cambria Math" w:hAnsi="Cambria Math"/>
+          </w:rPr>
+          <m:t>-</m:t>
+        </m:r>
+        <m:sSub>
+          <m:sSubPr>
+            <m:ctrlPr>
+              <w:rPr>
+                <w:rFonts w:ascii="Cambria Math" w:hAnsi="Cambria Math"/>
+                <w:i/>
+              </w:rPr>
+            </m:ctrlPr>
+          </m:sSubPr>
+          <m:e>
+            <m:r>
+              <w:rPr>
+                <w:rFonts w:ascii="Cambria Math" w:hAnsi="Cambria Math"/>
+              </w:rPr>
+              <m:t>t</m:t>
+            </m:r>
+          </m:e>
+          <m:sub>
+            <m:r>
+              <w:rPr>
+                <w:rFonts w:ascii="Cambria Math" w:hAnsi="Cambria Math"/>
+              </w:rPr>
+              <m:t>n</m:t>
+            </m:r>
+          </m:sub>
+        </m:sSub>
+        <m:r>
+          <w:rPr>
+            <w:rFonts w:ascii="Cambria Math" w:hAnsi="Cambria Math"/>
+          </w:rPr>
+          <m:t>=∆t</m:t>
+        </m:r>
+      </m:oMath>
+      <w:r>
+        <w:rPr>
+          <w:rFonts w:eastAsiaTheme="minorEastAsia"/>
+        </w:rPr>
+        <w:t xml:space="preserve"> alors on se retrouve avec </w:t>
+      </w:r>
+      <m:oMath>
+        <m:r>
+          <w:rPr>
+            <w:rFonts w:ascii="Cambria Math" w:hAnsi="Cambria Math"/>
+          </w:rPr>
+          <m:t>2=</m:t>
+        </m:r>
+        <m:f>
+          <m:fPr>
+            <m:ctrlPr>
+              <w:rPr>
+                <w:rFonts w:ascii="Cambria Math" w:hAnsi="Cambria Math"/>
+                <w:i/>
+              </w:rPr>
+            </m:ctrlPr>
+          </m:fPr>
+          <m:num>
+            <m:sSub>
+              <m:sSubPr>
+                <m:ctrlPr>
+                  <w:rPr>
+                    <w:rFonts w:ascii="Cambria Math" w:hAnsi="Cambria Math"/>
+                    <w:i/>
+                  </w:rPr>
+                </m:ctrlPr>
+              </m:sSubPr>
+              <m:e>
+                <m:r>
+                  <w:rPr>
+                    <w:rFonts w:ascii="Cambria Math" w:hAnsi="Cambria Math"/>
+                  </w:rPr>
+                  <m:t>P</m:t>
+                </m:r>
+              </m:e>
+              <m:sub>
+                <m:r>
+                  <w:rPr>
+                    <w:rFonts w:ascii="Cambria Math" w:hAnsi="Cambria Math"/>
+                  </w:rPr>
+                  <m:t>n+1</m:t>
+                </m:r>
+              </m:sub>
+            </m:sSub>
+            <m:r>
+              <w:rPr>
+                <w:rFonts w:ascii="Cambria Math" w:hAnsi="Cambria Math"/>
+              </w:rPr>
+              <m:t>-</m:t>
+            </m:r>
+            <m:sSub>
+              <m:sSubPr>
+                <m:ctrlPr>
+                  <w:rPr>
+                    <w:rFonts w:ascii="Cambria Math" w:hAnsi="Cambria Math"/>
+                    <w:i/>
+                  </w:rPr>
+                </m:ctrlPr>
+              </m:sSubPr>
+              <m:e>
+                <m:r>
+                  <w:rPr>
+                    <w:rFonts w:ascii="Cambria Math" w:hAnsi="Cambria Math"/>
+                  </w:rPr>
+                  <m:t>P</m:t>
+                </m:r>
+              </m:e>
+              <m:sub>
+                <m:r>
+                  <w:rPr>
+                    <w:rFonts w:ascii="Cambria Math" w:hAnsi="Cambria Math"/>
+                  </w:rPr>
+                  <m:t>n</m:t>
+                </m:r>
+              </m:sub>
+            </m:sSub>
+          </m:num>
+          <m:den>
+            <m:r>
+              <w:rPr>
+                <w:rFonts w:ascii="Cambria Math" w:hAnsi="Cambria Math"/>
+              </w:rPr>
+              <m:t>∆t</m:t>
+            </m:r>
+          </m:den>
+        </m:f>
+      </m:oMath>
+      <w:r>
+        <w:rPr>
+          <w:rFonts w:eastAsiaTheme="minorEastAsia"/>
+        </w:rPr>
+        <w:t xml:space="preserve"> </w:t>
+      </w:r>
+      <m:oMath>
+        <m:r>
+          <w:rPr>
+            <w:rFonts w:ascii="Cambria Math" w:eastAsiaTheme="minorEastAsia" w:hAnsi="Cambria Math"/>
+          </w:rPr>
+          <m:t>→</m:t>
+        </m:r>
+      </m:oMath>
+      <w:r>
+        <w:rPr>
+          <w:rFonts w:eastAsiaTheme="minorEastAsia"/>
+        </w:rPr>
+        <w:t xml:space="preserve"> </w:t>
+      </w:r>
+      <m:oMath>
+        <m:sSub>
+          <m:sSubPr>
+            <m:ctrlPr>
+              <w:rPr>
+                <w:rFonts w:ascii="Cambria Math" w:hAnsi="Cambria Math"/>
+                <w:i/>
+              </w:rPr>
+            </m:ctrlPr>
+          </m:sSubPr>
+          <m:e>
+            <m:r>
+              <w:rPr>
+                <w:rFonts w:ascii="Cambria Math" w:hAnsi="Cambria Math"/>
+              </w:rPr>
+              <m:t>P</m:t>
+            </m:r>
+          </m:e>
+          <m:sub>
+            <m:r>
+              <w:rPr>
+                <w:rFonts w:ascii="Cambria Math" w:hAnsi="Cambria Math"/>
+              </w:rPr>
+              <m:t>n+1</m:t>
+            </m:r>
+          </m:sub>
+        </m:sSub>
+        <m:r>
+          <w:rPr>
+            <w:rFonts w:ascii="Cambria Math" w:hAnsi="Cambria Math"/>
+          </w:rPr>
+          <m:t>-</m:t>
+        </m:r>
+        <m:sSub>
+          <m:sSubPr>
+            <m:ctrlPr>
+              <w:rPr>
+                <w:rFonts w:ascii="Cambria Math" w:hAnsi="Cambria Math"/>
+                <w:i/>
+              </w:rPr>
+            </m:ctrlPr>
+          </m:sSubPr>
+          <m:e>
+            <m:r>
+              <w:rPr>
+                <w:rFonts w:ascii="Cambria Math" w:hAnsi="Cambria Math"/>
+              </w:rPr>
+              <m:t>P</m:t>
+            </m:r>
+          </m:e>
+          <m:sub>
+            <m:r>
+              <w:rPr>
+                <w:rFonts w:ascii="Cambria Math" w:hAnsi="Cambria Math"/>
+              </w:rPr>
+              <m:t>n</m:t>
+            </m:r>
+          </m:sub>
+        </m:sSub>
+        <m:r>
+          <w:rPr>
+            <w:rFonts w:ascii="Cambria Math" w:eastAsiaTheme="minorEastAsia" w:hAnsi="Cambria Math"/>
+          </w:rPr>
+          <m:t>=2∆t</m:t>
+        </m:r>
+        <m:r>
+          <w:rPr>
+            <w:rFonts w:ascii="Cambria Math" w:eastAsiaTheme="minorEastAsia" w:hAnsi="Cambria Math"/>
+          </w:rPr>
+          <m:t>→</m:t>
+        </m:r>
+        <m:r>
+          <w:rPr>
+            <w:rFonts w:ascii="Cambria Math" w:eastAsiaTheme="minorEastAsia" w:hAnsi="Cambria Math"/>
+          </w:rPr>
+          <m:t xml:space="preserve"> </m:t>
+        </m:r>
+        <m:sSub>
+          <m:sSubPr>
+            <m:ctrlPr>
+              <w:rPr>
+                <w:rFonts w:ascii="Cambria Math" w:hAnsi="Cambria Math"/>
+                <w:i/>
+              </w:rPr>
+            </m:ctrlPr>
+          </m:sSubPr>
+          <m:e>
+            <m:r>
+              <w:rPr>
+                <w:rFonts w:ascii="Cambria Math" w:hAnsi="Cambria Math"/>
+              </w:rPr>
+              <m:t>P</m:t>
+            </m:r>
+          </m:e>
+          <m:sub>
+            <m:r>
+              <w:rPr>
+                <w:rFonts w:ascii="Cambria Math" w:hAnsi="Cambria Math"/>
+              </w:rPr>
+              <m:t>n+1</m:t>
+            </m:r>
+          </m:sub>
+        </m:sSub>
+        <m:r>
+          <w:rPr>
+            <w:rFonts w:ascii="Cambria Math" w:hAnsi="Cambria Math"/>
+          </w:rPr>
+          <m:t>=</m:t>
+        </m:r>
+        <m:sSub>
+          <m:sSubPr>
+            <m:ctrlPr>
+              <w:rPr>
+                <w:rFonts w:ascii="Cambria Math" w:hAnsi="Cambria Math"/>
+                <w:i/>
+              </w:rPr>
+            </m:ctrlPr>
+          </m:sSubPr>
+          <m:e>
+            <m:r>
+              <w:rPr>
+                <w:rFonts w:ascii="Cambria Math" w:hAnsi="Cambria Math"/>
+              </w:rPr>
+              <m:t>P</m:t>
+            </m:r>
+          </m:e>
+          <m:sub>
+            <m:r>
+              <w:rPr>
+                <w:rFonts w:ascii="Cambria Math" w:hAnsi="Cambria Math"/>
+              </w:rPr>
+              <m:t>n</m:t>
+            </m:r>
+          </m:sub>
+        </m:sSub>
+        <m:r>
+          <w:rPr>
+            <w:rFonts w:ascii="Cambria Math" w:hAnsi="Cambria Math"/>
+          </w:rPr>
+          <m:t>+</m:t>
+        </m:r>
+        <m:r>
+          <w:rPr>
+            <w:rFonts w:ascii="Cambria Math" w:eastAsiaTheme="minorEastAsia" w:hAnsi="Cambria Math"/>
+          </w:rPr>
+          <m:t>2∆t</m:t>
+        </m:r>
+      </m:oMath>
+    </w:p>
+    <w:p>
+      <w:pPr>
+        <w:rPr>
+          <w:rFonts w:eastAsiaTheme="minorEastAsia"/>
+        </w:rPr>
+      </w:pPr>
+      <w:r>
+        <w:rPr>
+          <w:rFonts w:eastAsiaTheme="minorEastAsia"/>
+        </w:rPr>
+        <w:t xml:space="preserve">Initialisation : </w:t>
+      </w:r>
+      <w:r>
+        <w:rPr>
+          <w:rFonts w:eastAsiaTheme="minorEastAsia"/>
+        </w:rPr>
+        <w:t xml:space="preserve">On prouve que la propriété est vraie au premier rang de départ </w:t>
+      </w:r>
+      <m:oMath>
+        <m:sSub>
+          <m:sSubPr>
+            <m:ctrlPr>
+              <w:rPr>
+                <w:rFonts w:ascii="Cambria Math" w:eastAsiaTheme="minorEastAsia" w:hAnsi="Cambria Math"/>
+                <w:i/>
+              </w:rPr>
+            </m:ctrlPr>
+          </m:sSubPr>
+          <m:e>
+            <m:r>
+              <w:rPr>
+                <w:rFonts w:ascii="Cambria Math" w:eastAsiaTheme="minorEastAsia" w:hAnsi="Cambria Math"/>
+              </w:rPr>
+              <m:t>n</m:t>
+            </m:r>
+          </m:e>
+          <m:sub>
+            <m:r>
+              <w:rPr>
+                <w:rFonts w:ascii="Cambria Math" w:eastAsiaTheme="minorEastAsia" w:hAnsi="Cambria Math"/>
+              </w:rPr>
+              <m:t>0</m:t>
+            </m:r>
+          </m:sub>
+        </m:sSub>
+        <m:r>
+          <w:rPr>
+            <w:rFonts w:ascii="Cambria Math" w:eastAsiaTheme="minorEastAsia" w:hAnsi="Cambria Math"/>
+          </w:rPr>
+          <m:t> </m:t>
+        </m:r>
+      </m:oMath>
+      <w:r>
+        <w:rPr>
+          <w:rFonts w:eastAsiaTheme="minorEastAsia"/>
+        </w:rPr>
+        <w:t>:</w:t>
+      </w:r>
+    </w:p>
+    <w:p>
+      <w:pPr>
+        <w:rPr>
+          <w:rFonts w:eastAsiaTheme="minorEastAsia"/>
+        </w:rPr>
+      </w:pPr>
+      <w:r>
+        <w:rPr>
+          <w:rFonts w:eastAsiaTheme="minorEastAsia"/>
+        </w:rPr>
+        <w:t xml:space="preserve">Comme </w:t>
+      </w:r>
+      <m:oMath>
+        <m:r>
+          <w:rPr>
+            <w:rFonts w:ascii="Cambria Math" w:eastAsiaTheme="minorEastAsia" w:hAnsi="Cambria Math"/>
+          </w:rPr>
+          <m:t>P</m:t>
+        </m:r>
+        <m:d>
+          <m:dPr>
+            <m:ctrlPr>
+              <w:rPr>
+                <w:rFonts w:ascii="Cambria Math" w:eastAsiaTheme="minorEastAsia" w:hAnsi="Cambria Math"/>
+                <w:i/>
+              </w:rPr>
+            </m:ctrlPr>
+          </m:dPr>
+          <m:e>
+            <m:r>
+              <w:rPr>
+                <w:rFonts w:ascii="Cambria Math" w:eastAsiaTheme="minorEastAsia" w:hAnsi="Cambria Math"/>
+              </w:rPr>
+              <m:t>0</m:t>
+            </m:r>
+          </m:e>
+        </m:d>
+        <m:r>
+          <w:rPr>
+            <w:rFonts w:ascii="Cambria Math" w:eastAsiaTheme="minorEastAsia" w:hAnsi="Cambria Math"/>
+          </w:rPr>
+          <m:t>=0</m:t>
+        </m:r>
+      </m:oMath>
+      <w:r>
+        <w:rPr>
+          <w:rFonts w:eastAsiaTheme="minorEastAsia"/>
+        </w:rPr>
+        <w:t xml:space="preserve"> </w:t>
+      </w:r>
+      <m:oMath>
+        <m:r>
+          <w:rPr>
+            <w:rFonts w:ascii="Cambria Math" w:eastAsiaTheme="minorEastAsia" w:hAnsi="Cambria Math"/>
+          </w:rPr>
+          <m:t>→</m:t>
+        </m:r>
+      </m:oMath>
+      <w:r>
+        <w:rPr>
+          <w:rFonts w:eastAsiaTheme="minorEastAsia"/>
+        </w:rPr>
+        <w:t xml:space="preserve"> </w:t>
+      </w:r>
+      <m:oMath>
+        <m:sSub>
+          <m:sSubPr>
+            <m:ctrlPr>
+              <w:rPr>
+                <w:rFonts w:ascii="Cambria Math" w:hAnsi="Cambria Math"/>
+                <w:i/>
+              </w:rPr>
+            </m:ctrlPr>
+          </m:sSubPr>
+          <m:e>
+            <m:r>
+              <w:rPr>
+                <w:rFonts w:ascii="Cambria Math" w:hAnsi="Cambria Math"/>
+              </w:rPr>
+              <m:t>P</m:t>
+            </m:r>
+          </m:e>
+          <m:sub>
+            <m:r>
+              <w:rPr>
+                <w:rFonts w:ascii="Cambria Math" w:hAnsi="Cambria Math"/>
+              </w:rPr>
+              <m:t>1</m:t>
+            </m:r>
+          </m:sub>
+        </m:sSub>
+        <m:r>
+          <w:rPr>
+            <w:rFonts w:ascii="Cambria Math" w:hAnsi="Cambria Math"/>
+          </w:rPr>
+          <m:t>=</m:t>
+        </m:r>
+        <m:r>
+          <w:rPr>
+            <w:rFonts w:ascii="Cambria Math" w:hAnsi="Cambria Math"/>
+          </w:rPr>
+          <m:t>0</m:t>
+        </m:r>
+        <m:r>
+          <w:rPr>
+            <w:rFonts w:ascii="Cambria Math" w:hAnsi="Cambria Math"/>
+          </w:rPr>
+          <m:t>+</m:t>
+        </m:r>
+        <m:r>
+          <w:rPr>
+            <w:rFonts w:ascii="Cambria Math" w:eastAsiaTheme="minorEastAsia" w:hAnsi="Cambria Math"/>
+          </w:rPr>
+          <m:t>2</m:t>
+        </m:r>
+        <m:r>
+          <w:rPr>
+            <w:rFonts w:ascii="Cambria Math" w:eastAsiaTheme="minorEastAsia" w:hAnsi="Cambria Math"/>
+          </w:rPr>
+          <m:t>=2</m:t>
+        </m:r>
+      </m:oMath>
+    </w:p>
+    <w:p>
+      <w:pPr>
+        <w:rPr>
+          <w:rFonts w:eastAsiaTheme="minorEastAsia"/>
+        </w:rPr>
+      </w:pPr>
+      <w:r>
+        <w:rPr>
+          <w:rFonts w:eastAsiaTheme="minorEastAsia"/>
+        </w:rPr>
+        <w:tab/>
+      </w:r>
+      <w:r>
+        <w:rPr>
+          <w:rFonts w:eastAsiaTheme="minorEastAsia"/>
+        </w:rPr>
+        <w:tab/>
+      </w:r>
+      <w:r>
+        <w:rPr>
+          <w:rFonts w:eastAsiaTheme="minorEastAsia"/>
+        </w:rPr>
+        <w:tab/>
+      </w:r>
+      <m:oMath>
+        <m:sSub>
+          <m:sSubPr>
+            <m:ctrlPr>
+              <w:rPr>
+                <w:rFonts w:ascii="Cambria Math" w:hAnsi="Cambria Math"/>
+                <w:i/>
+              </w:rPr>
+            </m:ctrlPr>
+          </m:sSubPr>
+          <m:e>
+            <m:r>
+              <w:rPr>
+                <w:rFonts w:ascii="Cambria Math" w:hAnsi="Cambria Math"/>
+              </w:rPr>
+              <m:t>P</m:t>
+            </m:r>
+          </m:e>
+          <m:sub>
+            <m:r>
+              <w:rPr>
+                <w:rFonts w:ascii="Cambria Math" w:hAnsi="Cambria Math"/>
+              </w:rPr>
+              <m:t>2</m:t>
+            </m:r>
+          </m:sub>
+        </m:sSub>
+        <m:r>
+          <w:rPr>
+            <w:rFonts w:ascii="Cambria Math" w:hAnsi="Cambria Math"/>
+          </w:rPr>
+          <m:t>=</m:t>
+        </m:r>
+        <m:r>
+          <w:rPr>
+            <w:rFonts w:ascii="Cambria Math" w:hAnsi="Cambria Math"/>
+          </w:rPr>
+          <m:t>2</m:t>
+        </m:r>
+        <m:r>
+          <w:rPr>
+            <w:rFonts w:ascii="Cambria Math" w:hAnsi="Cambria Math"/>
+          </w:rPr>
+          <m:t>+</m:t>
+        </m:r>
+        <m:r>
+          <w:rPr>
+            <w:rFonts w:ascii="Cambria Math" w:eastAsiaTheme="minorEastAsia" w:hAnsi="Cambria Math"/>
+          </w:rPr>
+          <m:t>2=</m:t>
+        </m:r>
+        <m:r>
+          <w:rPr>
+            <w:rFonts w:ascii="Cambria Math" w:eastAsiaTheme="minorEastAsia" w:hAnsi="Cambria Math"/>
+          </w:rPr>
+          <m:t>4</m:t>
+        </m:r>
+      </m:oMath>
+    </w:p>
+    <w:p>
+      <w:pPr>
+        <w:rPr>
+          <w:rFonts w:eastAsiaTheme="minorEastAsia"/>
+        </w:rPr>
+      </w:pPr>
+      <w:r>
+        <w:rPr>
+          <w:rFonts w:eastAsiaTheme="minorEastAsia"/>
+        </w:rPr>
+        <w:tab/>
+      </w:r>
+      <w:r>
+        <w:rPr>
+          <w:rFonts w:eastAsiaTheme="minorEastAsia"/>
+        </w:rPr>
+        <w:tab/>
+      </w:r>
+      <w:r>
+        <w:rPr>
+          <w:rFonts w:eastAsiaTheme="minorEastAsia"/>
+        </w:rPr>
+        <w:tab/>
+      </w:r>
+      <m:oMath>
+        <m:sSub>
+          <m:sSubPr>
+            <m:ctrlPr>
+              <w:rPr>
+                <w:rFonts w:ascii="Cambria Math" w:hAnsi="Cambria Math"/>
+                <w:i/>
+              </w:rPr>
+            </m:ctrlPr>
+          </m:sSubPr>
+          <m:e>
+            <m:r>
+              <w:rPr>
+                <w:rFonts w:ascii="Cambria Math" w:hAnsi="Cambria Math"/>
+              </w:rPr>
+              <m:t>P</m:t>
+            </m:r>
+          </m:e>
+          <m:sub>
+            <m:r>
+              <w:rPr>
+                <w:rFonts w:ascii="Cambria Math" w:hAnsi="Cambria Math"/>
+              </w:rPr>
+              <m:t>3</m:t>
+            </m:r>
+          </m:sub>
+        </m:sSub>
+        <m:r>
+          <w:rPr>
+            <w:rFonts w:ascii="Cambria Math" w:hAnsi="Cambria Math"/>
+          </w:rPr>
+          <m:t>=</m:t>
+        </m:r>
+        <m:r>
+          <w:rPr>
+            <w:rFonts w:ascii="Cambria Math" w:hAnsi="Cambria Math"/>
+          </w:rPr>
+          <m:t>4</m:t>
+        </m:r>
+        <m:r>
+          <w:rPr>
+            <w:rFonts w:ascii="Cambria Math" w:hAnsi="Cambria Math"/>
+          </w:rPr>
+          <m:t>+</m:t>
+        </m:r>
+        <m:r>
+          <w:rPr>
+            <w:rFonts w:ascii="Cambria Math" w:eastAsiaTheme="minorEastAsia" w:hAnsi="Cambria Math"/>
+          </w:rPr>
+          <m:t>2=</m:t>
+        </m:r>
+        <m:r>
+          <w:rPr>
+            <w:rFonts w:ascii="Cambria Math" w:eastAsiaTheme="minorEastAsia" w:hAnsi="Cambria Math"/>
+          </w:rPr>
+          <m:t>6</m:t>
+        </m:r>
+      </m:oMath>
+    </w:p>
+    <w:p>
+      <w:pPr>
+        <w:rPr>
+          <w:rFonts w:eastAsiaTheme="minorEastAsia"/>
+        </w:rPr>
+      </w:pPr>
+      <w:r>
+        <w:rPr>
+          <w:rFonts w:eastAsiaTheme="minorEastAsia"/>
+        </w:rPr>
+        <w:t xml:space="preserve">L’hérédité : </w:t>
+      </w:r>
+      <w:r>
+        <w:rPr>
+          <w:rFonts w:eastAsiaTheme="minorEastAsia"/>
+        </w:rPr>
+        <w:t>On suppose qu'à un rang k ≥ n₀ quelconque, la propriété est vraie. On doit alors démontrer qu'elle est encore vraie au rang suivant k+1.</w:t>
+      </w:r>
+    </w:p>
+    <w:p>
+      <w:pPr>
+        <w:rPr>
+          <w:rFonts w:eastAsiaTheme="minorEastAsia"/>
+        </w:rPr>
+      </w:pPr>
+      <w:r>
+        <w:rPr>
+          <w:rFonts w:eastAsiaTheme="minorEastAsia"/>
+        </w:rPr>
+        <w:t xml:space="preserve"> </w:t>
+      </w:r>
+      <m:oMath>
+        <m:sSub>
+          <m:sSubPr>
+            <m:ctrlPr>
+              <w:rPr>
+                <w:rFonts w:ascii="Cambria Math" w:hAnsi="Cambria Math"/>
+                <w:i/>
+              </w:rPr>
+            </m:ctrlPr>
+          </m:sSubPr>
+          <m:e>
+            <m:r>
+              <w:rPr>
+                <w:rFonts w:ascii="Cambria Math" w:hAnsi="Cambria Math"/>
+              </w:rPr>
+              <m:t>P</m:t>
+            </m:r>
+          </m:e>
+          <m:sub>
+            <m:r>
+              <w:rPr>
+                <w:rFonts w:ascii="Cambria Math" w:hAnsi="Cambria Math"/>
+              </w:rPr>
+              <m:t>n+1</m:t>
+            </m:r>
+          </m:sub>
+        </m:sSub>
+        <m:r>
+          <w:rPr>
+            <w:rFonts w:ascii="Cambria Math" w:hAnsi="Cambria Math"/>
+          </w:rPr>
+          <m:t>=</m:t>
+        </m:r>
+        <m:sSub>
+          <m:sSubPr>
+            <m:ctrlPr>
+              <w:rPr>
+                <w:rFonts w:ascii="Cambria Math" w:hAnsi="Cambria Math"/>
+                <w:i/>
+              </w:rPr>
+            </m:ctrlPr>
+          </m:sSubPr>
+          <m:e>
+            <m:r>
+              <w:rPr>
+                <w:rFonts w:ascii="Cambria Math" w:hAnsi="Cambria Math"/>
+              </w:rPr>
+              <m:t>P</m:t>
+            </m:r>
+          </m:e>
+          <m:sub>
+            <m:r>
+              <w:rPr>
+                <w:rFonts w:ascii="Cambria Math" w:hAnsi="Cambria Math"/>
+              </w:rPr>
+              <m:t>n</m:t>
+            </m:r>
+          </m:sub>
+        </m:sSub>
+        <m:r>
+          <w:rPr>
+            <w:rFonts w:ascii="Cambria Math" w:hAnsi="Cambria Math"/>
+          </w:rPr>
+          <m:t>+</m:t>
+        </m:r>
+        <m:r>
+          <w:rPr>
+            <w:rFonts w:ascii="Cambria Math" w:eastAsiaTheme="minorEastAsia" w:hAnsi="Cambria Math"/>
+          </w:rPr>
+          <m:t>2∆t</m:t>
+        </m:r>
+      </m:oMath>
+      <w:r>
+        <w:rPr>
+          <w:rFonts w:eastAsiaTheme="minorEastAsia"/>
+        </w:rPr>
+        <w:t xml:space="preserve"> </w:t>
+      </w:r>
+      <m:oMath>
+        <m:r>
+          <w:rPr>
+            <w:rFonts w:ascii="Cambria Math" w:eastAsiaTheme="minorEastAsia" w:hAnsi="Cambria Math"/>
+          </w:rPr>
+          <m:t>→</m:t>
+        </m:r>
+        <m:r>
+          <w:rPr>
+            <w:rFonts w:ascii="Cambria Math" w:eastAsiaTheme="minorEastAsia" w:hAnsi="Cambria Math"/>
+          </w:rPr>
+          <m:t xml:space="preserve"> </m:t>
+        </m:r>
+        <m:sSub>
+          <m:sSubPr>
+            <m:ctrlPr>
+              <w:rPr>
+                <w:rFonts w:ascii="Cambria Math" w:hAnsi="Cambria Math"/>
+                <w:i/>
+              </w:rPr>
+            </m:ctrlPr>
+          </m:sSubPr>
+          <m:e>
+            <m:r>
+              <w:rPr>
+                <w:rFonts w:ascii="Cambria Math" w:hAnsi="Cambria Math"/>
+              </w:rPr>
+              <m:t>P</m:t>
+            </m:r>
+          </m:e>
+          <m:sub>
+            <m:r>
+              <w:rPr>
+                <w:rFonts w:ascii="Cambria Math" w:hAnsi="Cambria Math"/>
+              </w:rPr>
+              <m:t>n+1</m:t>
+            </m:r>
+          </m:sub>
+        </m:sSub>
+        <m:r>
+          <w:rPr>
+            <w:rFonts w:ascii="Cambria Math" w:hAnsi="Cambria Math"/>
+          </w:rPr>
+          <m:t>=</m:t>
+        </m:r>
+        <m:sSub>
+          <m:sSubPr>
+            <m:ctrlPr>
+              <w:rPr>
+                <w:rFonts w:ascii="Cambria Math" w:hAnsi="Cambria Math"/>
+                <w:i/>
+              </w:rPr>
+            </m:ctrlPr>
+          </m:sSubPr>
+          <m:e>
+            <m:r>
+              <w:rPr>
+                <w:rFonts w:ascii="Cambria Math" w:hAnsi="Cambria Math"/>
+              </w:rPr>
+              <m:t>P</m:t>
+            </m:r>
+          </m:e>
+          <m:sub>
+            <m:r>
+              <w:rPr>
+                <w:rFonts w:ascii="Cambria Math" w:hAnsi="Cambria Math"/>
+              </w:rPr>
+              <m:t>n</m:t>
+            </m:r>
+          </m:sub>
+        </m:sSub>
+        <m:r>
+          <w:rPr>
+            <w:rFonts w:ascii="Cambria Math" w:hAnsi="Cambria Math"/>
+          </w:rPr>
+          <m:t>+</m:t>
+        </m:r>
+        <m:r>
+          <w:rPr>
+            <w:rFonts w:ascii="Cambria Math" w:eastAsiaTheme="minorEastAsia" w:hAnsi="Cambria Math"/>
+          </w:rPr>
+          <m:t>2∆t</m:t>
+        </m:r>
+      </m:oMath>
+    </w:p>
+    <w:p>
+      <w:pPr>
+        <w:rPr>
+          <w:rFonts w:eastAsiaTheme="minorEastAsia"/>
+        </w:rPr>
+      </w:pPr>
+      <w:r>
+        <w:rPr>
+          <w:rFonts w:eastAsiaTheme="minorEastAsia"/>
+        </w:rPr>
+        <w:tab/>
+      </w:r>
+      <w:r>
+        <w:rPr>
+          <w:rFonts w:eastAsiaTheme="minorEastAsia"/>
+        </w:rPr>
+        <w:tab/>
+      </w:r>
+      <w:r>
+        <w:rPr>
+          <w:rFonts w:eastAsiaTheme="minorEastAsia"/>
+        </w:rPr>
+        <w:tab/>
+      </w:r>
+      <m:oMath>
+        <m:sSub>
+          <m:sSubPr>
+            <m:ctrlPr>
+              <w:rPr>
+                <w:rFonts w:ascii="Cambria Math" w:hAnsi="Cambria Math"/>
+                <w:i/>
+              </w:rPr>
+            </m:ctrlPr>
+          </m:sSubPr>
+          <m:e>
+            <m:r>
+              <w:rPr>
+                <w:rFonts w:ascii="Cambria Math" w:hAnsi="Cambria Math"/>
+              </w:rPr>
+              <m:t>P</m:t>
+            </m:r>
+          </m:e>
+          <m:sub>
+            <m:r>
+              <w:rPr>
+                <w:rFonts w:ascii="Cambria Math" w:hAnsi="Cambria Math"/>
+              </w:rPr>
+              <m:t>n+1</m:t>
+            </m:r>
+          </m:sub>
+        </m:sSub>
+        <m:r>
+          <w:rPr>
+            <w:rFonts w:ascii="Cambria Math" w:hAnsi="Cambria Math"/>
+          </w:rPr>
+          <m:t>+</m:t>
+        </m:r>
+        <m:r>
+          <w:rPr>
+            <w:rFonts w:ascii="Cambria Math" w:eastAsiaTheme="minorEastAsia" w:hAnsi="Cambria Math"/>
+          </w:rPr>
+          <m:t>2∆t</m:t>
+        </m:r>
+        <m:r>
+          <w:rPr>
+            <w:rFonts w:ascii="Cambria Math" w:hAnsi="Cambria Math"/>
+          </w:rPr>
+          <m:t>=</m:t>
+        </m:r>
+        <m:sSub>
+          <m:sSubPr>
+            <m:ctrlPr>
+              <w:rPr>
+                <w:rFonts w:ascii="Cambria Math" w:hAnsi="Cambria Math"/>
+                <w:i/>
+              </w:rPr>
+            </m:ctrlPr>
+          </m:sSubPr>
+          <m:e>
+            <m:r>
+              <w:rPr>
+                <w:rFonts w:ascii="Cambria Math" w:hAnsi="Cambria Math"/>
+              </w:rPr>
+              <m:t>P</m:t>
+            </m:r>
+          </m:e>
+          <m:sub>
+            <m:r>
+              <w:rPr>
+                <w:rFonts w:ascii="Cambria Math" w:hAnsi="Cambria Math"/>
+              </w:rPr>
+              <m:t>n</m:t>
+            </m:r>
+          </m:sub>
+        </m:sSub>
+        <m:r>
+          <w:rPr>
+            <w:rFonts w:ascii="Cambria Math" w:hAnsi="Cambria Math"/>
+          </w:rPr>
+          <m:t>+</m:t>
+        </m:r>
+        <m:r>
+          <w:rPr>
+            <w:rFonts w:ascii="Cambria Math" w:eastAsiaTheme="minorEastAsia" w:hAnsi="Cambria Math"/>
+          </w:rPr>
+          <m:t>2∆t</m:t>
+        </m:r>
+        <m:r>
+          <w:rPr>
+            <w:rFonts w:ascii="Cambria Math" w:eastAsiaTheme="minorEastAsia" w:hAnsi="Cambria Math"/>
+          </w:rPr>
+          <m:t>+</m:t>
+        </m:r>
+        <m:r>
+          <w:rPr>
+            <w:rFonts w:ascii="Cambria Math" w:eastAsiaTheme="minorEastAsia" w:hAnsi="Cambria Math"/>
+          </w:rPr>
+          <m:t>2∆t</m:t>
+        </m:r>
+      </m:oMath>
+    </w:p>
+    <w:p>
+      <w:pPr>
+        <w:rPr>
+          <w:rFonts w:eastAsiaTheme="minorEastAsia"/>
+        </w:rPr>
+      </w:pPr>
+      <w:r>
+        <w:rPr>
+          <w:rFonts w:eastAsiaTheme="minorEastAsia"/>
+        </w:rPr>
+        <w:tab/>
+      </w:r>
+      <w:r>
+        <w:rPr>
+          <w:rFonts w:eastAsiaTheme="minorEastAsia"/>
+        </w:rPr>
+        <w:tab/>
+      </w:r>
+      <w:r>
+        <w:rPr>
+          <w:rFonts w:eastAsiaTheme="minorEastAsia"/>
+        </w:rPr>
+        <w:tab/>
+      </w:r>
+      <m:oMath>
+        <m:sSub>
+          <m:sSubPr>
+            <m:ctrlPr>
+              <w:rPr>
+                <w:rFonts w:ascii="Cambria Math" w:hAnsi="Cambria Math"/>
+                <w:i/>
+              </w:rPr>
+            </m:ctrlPr>
+          </m:sSubPr>
+          <m:e>
+            <m:r>
+              <w:rPr>
+                <w:rFonts w:ascii="Cambria Math" w:hAnsi="Cambria Math"/>
+              </w:rPr>
+              <m:t>P</m:t>
+            </m:r>
+          </m:e>
+          <m:sub>
+            <m:r>
+              <w:rPr>
+                <w:rFonts w:ascii="Cambria Math" w:hAnsi="Cambria Math"/>
+              </w:rPr>
+              <m:t>n+1</m:t>
+            </m:r>
+          </m:sub>
+        </m:sSub>
+        <m:r>
+          <w:rPr>
+            <w:rFonts w:ascii="Cambria Math" w:hAnsi="Cambria Math"/>
+          </w:rPr>
+          <m:t>+</m:t>
+        </m:r>
+        <m:r>
+          <w:rPr>
+            <w:rFonts w:ascii="Cambria Math" w:eastAsiaTheme="minorEastAsia" w:hAnsi="Cambria Math"/>
+          </w:rPr>
+          <m:t>2∆t+</m:t>
+        </m:r>
+        <m:sSub>
+          <m:sSubPr>
+            <m:ctrlPr>
+              <w:rPr>
+                <w:rFonts w:ascii="Cambria Math" w:hAnsi="Cambria Math"/>
+                <w:i/>
+              </w:rPr>
+            </m:ctrlPr>
+          </m:sSubPr>
+          <m:e>
+            <m:r>
+              <w:rPr>
+                <w:rFonts w:ascii="Cambria Math" w:hAnsi="Cambria Math"/>
+              </w:rPr>
+              <m:t>P</m:t>
+            </m:r>
+          </m:e>
+          <m:sub>
+            <m:r>
+              <w:rPr>
+                <w:rFonts w:ascii="Cambria Math" w:hAnsi="Cambria Math"/>
+              </w:rPr>
+              <m:t>n</m:t>
+            </m:r>
+          </m:sub>
+        </m:sSub>
+        <m:r>
+          <w:rPr>
+            <w:rFonts w:ascii="Cambria Math" w:hAnsi="Cambria Math"/>
+          </w:rPr>
+          <m:t>=</m:t>
+        </m:r>
+        <m:sSub>
+          <m:sSubPr>
+            <m:ctrlPr>
+              <w:rPr>
+                <w:rFonts w:ascii="Cambria Math" w:hAnsi="Cambria Math"/>
+                <w:i/>
+              </w:rPr>
+            </m:ctrlPr>
+          </m:sSubPr>
+          <m:e>
+            <m:r>
+              <w:rPr>
+                <w:rFonts w:ascii="Cambria Math" w:hAnsi="Cambria Math"/>
+              </w:rPr>
+              <m:t>P</m:t>
+            </m:r>
+          </m:e>
+          <m:sub>
+            <m:r>
+              <w:rPr>
+                <w:rFonts w:ascii="Cambria Math" w:hAnsi="Cambria Math"/>
+              </w:rPr>
+              <m:t>n</m:t>
+            </m:r>
+          </m:sub>
+        </m:sSub>
+        <m:r>
+          <w:rPr>
+            <w:rFonts w:ascii="Cambria Math" w:hAnsi="Cambria Math"/>
+          </w:rPr>
+          <m:t>+</m:t>
+        </m:r>
+        <m:r>
+          <w:rPr>
+            <w:rFonts w:ascii="Cambria Math" w:eastAsiaTheme="minorEastAsia" w:hAnsi="Cambria Math"/>
+          </w:rPr>
+          <m:t>2∆t+2∆t</m:t>
+        </m:r>
+        <m:r>
+          <w:rPr>
+            <w:rFonts w:ascii="Cambria Math" w:eastAsiaTheme="minorEastAsia" w:hAnsi="Cambria Math"/>
+          </w:rPr>
+          <m:t>+</m:t>
+        </m:r>
+        <m:sSub>
+          <m:sSubPr>
+            <m:ctrlPr>
+              <w:rPr>
+                <w:rFonts w:ascii="Cambria Math" w:hAnsi="Cambria Math"/>
+                <w:i/>
+              </w:rPr>
+            </m:ctrlPr>
+          </m:sSubPr>
+          <m:e>
+            <m:r>
+              <w:rPr>
+                <w:rFonts w:ascii="Cambria Math" w:hAnsi="Cambria Math"/>
+              </w:rPr>
+              <m:t>P</m:t>
+            </m:r>
+          </m:e>
+          <m:sub>
+            <m:r>
+              <w:rPr>
+                <w:rFonts w:ascii="Cambria Math" w:hAnsi="Cambria Math"/>
+              </w:rPr>
+              <m:t>n</m:t>
+            </m:r>
+          </m:sub>
+        </m:sSub>
+      </m:oMath>
+    </w:p>
+    <w:p>
+      <w:pPr>
+        <w:rPr>
+          <w:rFonts w:eastAsiaTheme="minorEastAsia"/>
+        </w:rPr>
+      </w:pPr>
+      <w:r>
+        <w:rPr>
+          <w:rFonts w:eastAsiaTheme="minorEastAsia"/>
+        </w:rPr>
+        <w:t xml:space="preserve"> </w:t>
+      </w:r>
+      <w:r>
+        <w:rPr>
+          <w:rFonts w:eastAsiaTheme="minorEastAsia"/>
+        </w:rPr>
+        <w:tab/>
+      </w:r>
+      <w:r>
+        <w:rPr>
+          <w:rFonts w:eastAsiaTheme="minorEastAsia"/>
+        </w:rPr>
+        <w:tab/>
+      </w:r>
+      <w:r>
+        <w:rPr>
+          <w:rFonts w:eastAsiaTheme="minorEastAsia"/>
+        </w:rPr>
+        <w:tab/>
+      </w:r>
+      <m:oMath>
+        <m:sSub>
+          <m:sSubPr>
+            <m:ctrlPr>
+              <w:rPr>
+                <w:rFonts w:ascii="Cambria Math" w:hAnsi="Cambria Math"/>
+                <w:i/>
+              </w:rPr>
+            </m:ctrlPr>
+          </m:sSubPr>
+          <m:e>
+            <m:r>
+              <w:rPr>
+                <w:rFonts w:ascii="Cambria Math" w:hAnsi="Cambria Math"/>
+              </w:rPr>
+              <m:t>P</m:t>
+            </m:r>
+          </m:e>
+          <m:sub>
+            <m:r>
+              <w:rPr>
+                <w:rFonts w:ascii="Cambria Math" w:hAnsi="Cambria Math"/>
+              </w:rPr>
+              <m:t>n+</m:t>
+            </m:r>
+            <m:r>
+              <w:rPr>
+                <w:rFonts w:ascii="Cambria Math" w:hAnsi="Cambria Math"/>
+              </w:rPr>
+              <m:t>2</m:t>
+            </m:r>
+          </m:sub>
+        </m:sSub>
+        <m:r>
+          <w:rPr>
+            <w:rFonts w:ascii="Cambria Math" w:hAnsi="Cambria Math"/>
+          </w:rPr>
+          <m:t>=</m:t>
+        </m:r>
+        <m:sSub>
+          <m:sSubPr>
+            <m:ctrlPr>
+              <w:rPr>
+                <w:rFonts w:ascii="Cambria Math" w:hAnsi="Cambria Math"/>
+                <w:i/>
+              </w:rPr>
+            </m:ctrlPr>
+          </m:sSubPr>
+          <m:e>
+            <m:r>
+              <w:rPr>
+                <w:rFonts w:ascii="Cambria Math" w:hAnsi="Cambria Math"/>
+              </w:rPr>
+              <m:t>P</m:t>
+            </m:r>
+          </m:e>
+          <m:sub>
+            <m:r>
+              <w:rPr>
+                <w:rFonts w:ascii="Cambria Math" w:hAnsi="Cambria Math"/>
+              </w:rPr>
+              <m:t>n</m:t>
+            </m:r>
+            <m:r>
+              <w:rPr>
+                <w:rFonts w:ascii="Cambria Math" w:hAnsi="Cambria Math"/>
+              </w:rPr>
+              <m:t>+1</m:t>
+            </m:r>
+          </m:sub>
+        </m:sSub>
+        <m:r>
+          <w:rPr>
+            <w:rFonts w:ascii="Cambria Math" w:hAnsi="Cambria Math"/>
+          </w:rPr>
+          <m:t>+</m:t>
+        </m:r>
+        <m:r>
+          <w:rPr>
+            <w:rFonts w:ascii="Cambria Math" w:eastAsiaTheme="minorEastAsia" w:hAnsi="Cambria Math"/>
+          </w:rPr>
+          <m:t>2∆t</m:t>
+        </m:r>
+      </m:oMath>
+    </w:p>
+    <w:p>
+      <w:pPr>
+        <w:rPr>
+          <w:rFonts w:eastAsiaTheme="minorEastAsia"/>
+        </w:rPr>
+      </w:pPr>
+    </w:p>
+    <w:p>
+      <w:pPr>
+        <w:rPr>
+          <w:rFonts w:eastAsiaTheme="minorEastAsia"/>
+        </w:rPr>
+      </w:pPr>
+      <w:r>
+        <w:rPr>
+          <w:rFonts w:eastAsiaTheme="minorEastAsia"/>
+          <w:b/>
+          <w:bCs/>
+        </w:rPr>
+        <w:t>La conclusion</w:t>
+      </w:r>
+      <w:r>
+        <w:rPr>
+          <w:rFonts w:eastAsiaTheme="minorEastAsia"/>
+        </w:rPr>
+        <w:t xml:space="preserve"> : Par le principe de récurrence, on conclut que la propriété est vraie pour tout entier </w:t>
+      </w:r>
+      <m:oMath>
+        <m:r>
+          <w:rPr>
+            <w:rFonts w:ascii="Cambria Math" w:eastAsiaTheme="minorEastAsia" w:hAnsi="Cambria Math"/>
+          </w:rPr>
+          <m:t>n ≥</m:t>
+        </m:r>
+        <m:sSub>
+          <m:sSubPr>
+            <m:ctrlPr>
+              <w:rPr>
+                <w:rFonts w:ascii="Cambria Math" w:eastAsiaTheme="minorEastAsia" w:hAnsi="Cambria Math"/>
+                <w:i/>
+              </w:rPr>
+            </m:ctrlPr>
+          </m:sSubPr>
+          <m:e>
+            <m:r>
+              <w:rPr>
+                <w:rFonts w:ascii="Cambria Math" w:eastAsiaTheme="minorEastAsia" w:hAnsi="Cambria Math"/>
+              </w:rPr>
+              <m:t>n</m:t>
+            </m:r>
+          </m:e>
+          <m:sub>
+            <m:r>
+              <w:rPr>
+                <w:rFonts w:ascii="Cambria Math" w:eastAsiaTheme="minorEastAsia" w:hAnsi="Cambria Math"/>
+              </w:rPr>
+              <m:t>0</m:t>
+            </m:r>
+          </m:sub>
+        </m:sSub>
+      </m:oMath>
+      <w:r>
+        <w:rPr>
+          <w:rFonts w:eastAsiaTheme="minorEastAsia"/>
+        </w:rPr>
+        <w:t>.</w:t>
+      </w:r>
+    </w:p>
+    <w:p>
+      <w:pPr>
+        <w:rPr>
+          <w:rFonts w:eastAsiaTheme="minorEastAsia"/>
+        </w:rPr>
+      </w:pPr>
+    </w:p>
+    <w:p>
+      <w:pPr>
+        <w:rPr>
+          <w:rFonts w:eastAsiaTheme="minorEastAsia"/>
+        </w:rPr>
+      </w:pPr>
+      <w:r>
+        <w:rPr>
+          <w:rFonts w:eastAsiaTheme="minorEastAsia"/>
+        </w:rPr>
+        <w:t xml:space="preserve">4) </w:t>
+      </w:r>
+      <w:r>
+        <w:rPr>
+          <w:rFonts w:eastAsiaTheme="minorEastAsia"/>
+        </w:rPr>
+        <w:t xml:space="preserve">La solution théorique et la solution discrète sont identiques pour </w:t>
+      </w:r>
+      <m:oMath>
+        <m:r>
+          <m:rPr>
+            <m:sty m:val="p"/>
+          </m:rPr>
+          <w:rPr>
+            <w:rFonts w:ascii="Cambria Math" w:eastAsiaTheme="minorEastAsia" w:hAnsi="Cambria Math"/>
+          </w:rPr>
+          <m:t>Δ</m:t>
+        </m:r>
+        <m:r>
+          <w:rPr>
+            <w:rFonts w:ascii="Cambria Math" w:eastAsiaTheme="minorEastAsia" w:hAnsi="Cambria Math"/>
+          </w:rPr>
+          <m:t>t=1</m:t>
+        </m:r>
+      </m:oMath>
+      <w:r>
+        <w:rPr>
+          <w:rFonts w:eastAsiaTheme="minorEastAsia"/>
+        </w:rPr>
+        <w:t xml:space="preserve">. Les points obtenus avec la méthode discrète se situent donc sur la droite de la solution théorique. </w:t>
+      </w:r>
+      <w:r>
+        <w:rPr>
+          <w:rFonts w:eastAsiaTheme="minorEastAsia"/>
+        </w:rPr>
+        <w:lastRenderedPageBreak/>
+        <w:t>Dans cet exemple, l'approximation de la dérivée discrète donne exactement la solution aux instants considérés.</w:t>
+      </w:r>
+    </w:p>
+    <w:p>
+      <w:pPr>
+        <w:rPr>
+          <w:rFonts w:eastAsiaTheme="minorEastAsia"/>
+        </w:rPr>
+      </w:pPr>
+    </w:p>
+    <w:p>
+      <w:pPr>
+        <w:rPr>
+          <w:rFonts w:eastAsiaTheme="minorEastAsia"/>
+        </w:rPr>
+      </w:pPr>
+    </w:p>
+    <w:p>
+      <w:pPr>
+        <w:rPr>
+          <w:rFonts w:eastAsiaTheme="minorEastAsia"/>
+        </w:rPr>
+      </w:pPr>
+      <w:r>
+        <w:rPr>
+          <w:rFonts w:eastAsiaTheme="minorEastAsia"/>
+        </w:rPr>
+        <w:tab/>
+      </w:r>
+      <w:r>
+        <w:rPr>
+          <w:rFonts w:eastAsiaTheme="minorEastAsia"/>
+        </w:rPr>
+        <w:tab/>
+      </w:r>
+      <w:r>
+        <w:rPr>
+          <w:rFonts w:eastAsiaTheme="minorEastAsia"/>
+        </w:rPr>
+        <w:tab/>
+      </w:r>
     </w:p>
     <w:sectPr>
       <w:pgSz w:w="11906" w:h="16838"/>
@@ -1910,7 +3569,6 @@
   <w:style w:type="character" w:default="1" w:styleId="Policepardfaut">
     <w:name w:val="Default Paragraph Font"/>
     <w:uiPriority w:val="1"/>
-    <w:semiHidden/>
     <w:unhideWhenUsed/>
   </w:style>
   <w:style w:type="table" w:default="1" w:styleId="TableauNormal">
@@ -2550,4 +4208,16 @@
     </a:ext>
   </a:extLst>
 </a:theme>
+</file>
+
+<file path=customXml/item1.xml><?xml version="1.0" encoding="utf-8"?>
+<b:Sources xmlns:b="http://schemas.openxmlformats.org/officeDocument/2006/bibliography" xmlns="http://schemas.openxmlformats.org/officeDocument/2006/bibliography" SelectedStyle="\APASixthEditionOfficeOnline.xsl" StyleName="APA" Version="6"/>
+</file>
+
+<file path=customXml/itemProps1.xml><?xml version="1.0" encoding="utf-8"?>
+<ds:datastoreItem xmlns:ds="http://schemas.openxmlformats.org/officeDocument/2006/customXml" ds:itemID="{FFCB6722-4D60-481D-B046-CA1ADBA34C30}">
+  <ds:schemaRefs>
+    <ds:schemaRef ds:uri="http://schemas.openxmlformats.org/officeDocument/2006/bibliography"/>
+  </ds:schemaRefs>
+</ds:datastoreItem>
 </file>
</xml_diff>

<commit_message>
journal de bord + math update
</commit_message>
<xml_diff>
--- a/Maths/Moteur_RTS_exercices_2.docx
+++ b/Maths/Moteur_RTS_exercices_2.docx
@@ -564,7 +564,21 @@
         <w:rPr>
           <w:rFonts w:eastAsiaTheme="minorEastAsia"/>
         </w:rPr>
-        <w:t xml:space="preserve"> et pour tester on peux faire </w:t>
+        <w:t xml:space="preserve"> et pour tester on </w:t>
+      </w:r>
+      <w:proofErr w:type="gramStart"/>
+      <w:r>
+        <w:rPr>
+          <w:rFonts w:eastAsiaTheme="minorEastAsia"/>
+        </w:rPr>
+        <w:t>peux</w:t>
+      </w:r>
+      <w:proofErr w:type="gramEnd"/>
+      <w:r>
+        <w:rPr>
+          <w:rFonts w:eastAsiaTheme="minorEastAsia"/>
+        </w:rPr>
+        <w:t xml:space="preserve"> faire </w:t>
       </w:r>
       <m:oMath>
         <m:f>
@@ -1762,19 +1776,7 @@
           <w:rPr>
             <w:rFonts w:ascii="Cambria Math" w:eastAsiaTheme="minorEastAsia" w:hAnsi="Cambria Math"/>
           </w:rPr>
-          <m:t>=2∆t</m:t>
-        </m:r>
-        <m:r>
-          <w:rPr>
-            <w:rFonts w:ascii="Cambria Math" w:eastAsiaTheme="minorEastAsia" w:hAnsi="Cambria Math"/>
-          </w:rPr>
-          <m:t>→</m:t>
-        </m:r>
-        <m:r>
-          <w:rPr>
-            <w:rFonts w:ascii="Cambria Math" w:eastAsiaTheme="minorEastAsia" w:hAnsi="Cambria Math"/>
-          </w:rPr>
-          <m:t xml:space="preserve"> </m:t>
+          <m:t xml:space="preserve">=2∆t→ </m:t>
         </m:r>
         <m:sSub>
           <m:sSubPr>
@@ -1858,13 +1860,7 @@
         <w:rPr>
           <w:rFonts w:eastAsiaTheme="minorEastAsia"/>
         </w:rPr>
-        <w:t xml:space="preserve">Initialisation : </w:t>
-      </w:r>
-      <w:r>
-        <w:rPr>
-          <w:rFonts w:eastAsiaTheme="minorEastAsia"/>
-        </w:rPr>
-        <w:t xml:space="preserve">On prouve que la propriété est vraie au premier rang de départ </w:t>
+        <w:t xml:space="preserve">Initialisation : On prouve que la propriété est vraie au premier rang de départ </w:t>
       </w:r>
       <m:oMath>
         <m:sSub>
@@ -2002,31 +1998,13 @@
           <w:rPr>
             <w:rFonts w:ascii="Cambria Math" w:hAnsi="Cambria Math"/>
           </w:rPr>
-          <m:t>=</m:t>
-        </m:r>
-        <m:r>
-          <w:rPr>
-            <w:rFonts w:ascii="Cambria Math" w:hAnsi="Cambria Math"/>
-          </w:rPr>
-          <m:t>0</m:t>
-        </m:r>
-        <m:r>
-          <w:rPr>
-            <w:rFonts w:ascii="Cambria Math" w:hAnsi="Cambria Math"/>
-          </w:rPr>
-          <m:t>+</m:t>
+          <m:t>=0+</m:t>
         </m:r>
         <m:r>
           <w:rPr>
             <w:rFonts w:ascii="Cambria Math" w:eastAsiaTheme="minorEastAsia" w:hAnsi="Cambria Math"/>
           </w:rPr>
-          <m:t>2</m:t>
-        </m:r>
-        <m:r>
-          <w:rPr>
-            <w:rFonts w:ascii="Cambria Math" w:eastAsiaTheme="minorEastAsia" w:hAnsi="Cambria Math"/>
-          </w:rPr>
-          <m:t>=2</m:t>
+          <m:t>2=2</m:t>
         </m:r>
       </m:oMath>
     </w:p>
@@ -2085,31 +2063,13 @@
           <w:rPr>
             <w:rFonts w:ascii="Cambria Math" w:hAnsi="Cambria Math"/>
           </w:rPr>
-          <m:t>=</m:t>
-        </m:r>
-        <m:r>
-          <w:rPr>
-            <w:rFonts w:ascii="Cambria Math" w:hAnsi="Cambria Math"/>
-          </w:rPr>
-          <m:t>2</m:t>
-        </m:r>
-        <m:r>
-          <w:rPr>
-            <w:rFonts w:ascii="Cambria Math" w:hAnsi="Cambria Math"/>
-          </w:rPr>
-          <m:t>+</m:t>
+          <m:t>=2+</m:t>
         </m:r>
         <m:r>
           <w:rPr>
             <w:rFonts w:ascii="Cambria Math" w:eastAsiaTheme="minorEastAsia" w:hAnsi="Cambria Math"/>
           </w:rPr>
-          <m:t>2=</m:t>
-        </m:r>
-        <m:r>
-          <w:rPr>
-            <w:rFonts w:ascii="Cambria Math" w:eastAsiaTheme="minorEastAsia" w:hAnsi="Cambria Math"/>
-          </w:rPr>
-          <m:t>4</m:t>
+          <m:t>2=4</m:t>
         </m:r>
       </m:oMath>
     </w:p>
@@ -2168,31 +2128,13 @@
           <w:rPr>
             <w:rFonts w:ascii="Cambria Math" w:hAnsi="Cambria Math"/>
           </w:rPr>
-          <m:t>=</m:t>
-        </m:r>
-        <m:r>
-          <w:rPr>
-            <w:rFonts w:ascii="Cambria Math" w:hAnsi="Cambria Math"/>
-          </w:rPr>
-          <m:t>4</m:t>
-        </m:r>
-        <m:r>
-          <w:rPr>
-            <w:rFonts w:ascii="Cambria Math" w:hAnsi="Cambria Math"/>
-          </w:rPr>
-          <m:t>+</m:t>
+          <m:t>=4+</m:t>
         </m:r>
         <m:r>
           <w:rPr>
             <w:rFonts w:ascii="Cambria Math" w:eastAsiaTheme="minorEastAsia" w:hAnsi="Cambria Math"/>
           </w:rPr>
-          <m:t>2=</m:t>
-        </m:r>
-        <m:r>
-          <w:rPr>
-            <w:rFonts w:ascii="Cambria Math" w:eastAsiaTheme="minorEastAsia" w:hAnsi="Cambria Math"/>
-          </w:rPr>
-          <m:t>6</m:t>
+          <m:t>2=6</m:t>
         </m:r>
       </m:oMath>
     </w:p>
@@ -2310,13 +2252,7 @@
           <w:rPr>
             <w:rFonts w:ascii="Cambria Math" w:eastAsiaTheme="minorEastAsia" w:hAnsi="Cambria Math"/>
           </w:rPr>
-          <m:t>→</m:t>
-        </m:r>
-        <m:r>
-          <w:rPr>
-            <w:rFonts w:ascii="Cambria Math" w:eastAsiaTheme="minorEastAsia" w:hAnsi="Cambria Math"/>
-          </w:rPr>
-          <m:t xml:space="preserve"> </m:t>
+          <m:t xml:space="preserve">→ </m:t>
         </m:r>
         <m:sSub>
           <m:sSubPr>
@@ -2495,19 +2431,7 @@
           <w:rPr>
             <w:rFonts w:ascii="Cambria Math" w:eastAsiaTheme="minorEastAsia" w:hAnsi="Cambria Math"/>
           </w:rPr>
-          <m:t>2∆t</m:t>
-        </m:r>
-        <m:r>
-          <w:rPr>
-            <w:rFonts w:ascii="Cambria Math" w:eastAsiaTheme="minorEastAsia" w:hAnsi="Cambria Math"/>
-          </w:rPr>
-          <m:t>+</m:t>
-        </m:r>
-        <m:r>
-          <w:rPr>
-            <w:rFonts w:ascii="Cambria Math" w:eastAsiaTheme="minorEastAsia" w:hAnsi="Cambria Math"/>
-          </w:rPr>
-          <m:t>2∆t</m:t>
+          <m:t>2∆t+2∆t</m:t>
         </m:r>
       </m:oMath>
     </w:p>
@@ -2642,13 +2566,7 @@
           <w:rPr>
             <w:rFonts w:ascii="Cambria Math" w:eastAsiaTheme="minorEastAsia" w:hAnsi="Cambria Math"/>
           </w:rPr>
-          <m:t>2∆t+2∆t</m:t>
-        </m:r>
-        <m:r>
-          <w:rPr>
-            <w:rFonts w:ascii="Cambria Math" w:eastAsiaTheme="minorEastAsia" w:hAnsi="Cambria Math"/>
-          </w:rPr>
-          <m:t>+</m:t>
+          <m:t>2∆t+2∆t+</m:t>
         </m:r>
         <m:sSub>
           <m:sSubPr>
@@ -2731,13 +2649,7 @@
               <w:rPr>
                 <w:rFonts w:ascii="Cambria Math" w:hAnsi="Cambria Math"/>
               </w:rPr>
-              <m:t>n+</m:t>
-            </m:r>
-            <m:r>
-              <w:rPr>
-                <w:rFonts w:ascii="Cambria Math" w:hAnsi="Cambria Math"/>
-              </w:rPr>
-              <m:t>2</m:t>
+              <m:t>n+2</m:t>
             </m:r>
           </m:sub>
         </m:sSub>
@@ -2769,13 +2681,7 @@
               <w:rPr>
                 <w:rFonts w:ascii="Cambria Math" w:hAnsi="Cambria Math"/>
               </w:rPr>
-              <m:t>n</m:t>
-            </m:r>
-            <m:r>
-              <w:rPr>
-                <w:rFonts w:ascii="Cambria Math" w:hAnsi="Cambria Math"/>
-              </w:rPr>
-              <m:t>+1</m:t>
+              <m:t>n+1</m:t>
             </m:r>
           </m:sub>
         </m:sSub>
@@ -2949,12 +2855,1182 @@
         </w:rPr>
         <w:tab/>
       </w:r>
+    </w:p>
+    <w:p>
+      <w:pPr>
+        <w:rPr>
+          <w:rFonts w:eastAsiaTheme="minorEastAsia"/>
+        </w:rPr>
+      </w:pPr>
+      <w:r>
+        <w:rPr>
+          <w:rFonts w:eastAsiaTheme="minorEastAsia"/>
+        </w:rPr>
+        <w:t xml:space="preserve">2.2 </w:t>
+      </w:r>
+      <w:r>
+        <w:rPr>
+          <w:rFonts w:eastAsiaTheme="minorEastAsia"/>
+        </w:rPr>
+        <w:t>Méthode d’Euler explicite</w:t>
+      </w:r>
+    </w:p>
+    <w:p>
+      <w:pPr>
+        <w:rPr>
+          <w:rFonts w:eastAsiaTheme="minorEastAsia"/>
+        </w:rPr>
+      </w:pPr>
+      <w:r>
+        <w:rPr>
+          <w:rFonts w:eastAsiaTheme="minorEastAsia"/>
+        </w:rPr>
+        <w:t xml:space="preserve">(1) On a </w:t>
+      </w:r>
+      <m:oMath>
+        <m:f>
+          <m:fPr>
+            <m:ctrlPr>
+              <w:rPr>
+                <w:rFonts w:ascii="Cambria Math" w:hAnsi="Cambria Math"/>
+                <w:i/>
+              </w:rPr>
+            </m:ctrlPr>
+          </m:fPr>
+          <m:num>
+            <m:r>
+              <w:rPr>
+                <w:rFonts w:ascii="Cambria Math" w:hAnsi="Cambria Math"/>
+              </w:rPr>
+              <m:t>dP</m:t>
+            </m:r>
+          </m:num>
+          <m:den>
+            <m:r>
+              <w:rPr>
+                <w:rFonts w:ascii="Cambria Math" w:hAnsi="Cambria Math"/>
+              </w:rPr>
+              <m:t>dt</m:t>
+            </m:r>
+          </m:den>
+        </m:f>
+        <m:r>
+          <w:rPr>
+            <w:rFonts w:ascii="Cambria Math" w:hAnsi="Cambria Math"/>
+          </w:rPr>
+          <m:t xml:space="preserve"> ≈</m:t>
+        </m:r>
+        <m:f>
+          <m:fPr>
+            <m:ctrlPr>
+              <w:rPr>
+                <w:rFonts w:ascii="Cambria Math" w:hAnsi="Cambria Math"/>
+                <w:i/>
+              </w:rPr>
+            </m:ctrlPr>
+          </m:fPr>
+          <m:num>
+            <m:sSub>
+              <m:sSubPr>
+                <m:ctrlPr>
+                  <w:rPr>
+                    <w:rFonts w:ascii="Cambria Math" w:hAnsi="Cambria Math"/>
+                    <w:i/>
+                  </w:rPr>
+                </m:ctrlPr>
+              </m:sSubPr>
+              <m:e>
+                <m:r>
+                  <w:rPr>
+                    <w:rFonts w:ascii="Cambria Math" w:hAnsi="Cambria Math"/>
+                  </w:rPr>
+                  <m:t>P</m:t>
+                </m:r>
+              </m:e>
+              <m:sub>
+                <m:r>
+                  <w:rPr>
+                    <w:rFonts w:ascii="Cambria Math" w:hAnsi="Cambria Math"/>
+                  </w:rPr>
+                  <m:t>n+1</m:t>
+                </m:r>
+              </m:sub>
+            </m:sSub>
+            <m:r>
+              <w:rPr>
+                <w:rFonts w:ascii="Cambria Math" w:hAnsi="Cambria Math"/>
+              </w:rPr>
+              <m:t>-</m:t>
+            </m:r>
+            <m:sSub>
+              <m:sSubPr>
+                <m:ctrlPr>
+                  <w:rPr>
+                    <w:rFonts w:ascii="Cambria Math" w:hAnsi="Cambria Math"/>
+                    <w:i/>
+                  </w:rPr>
+                </m:ctrlPr>
+              </m:sSubPr>
+              <m:e>
+                <m:r>
+                  <w:rPr>
+                    <w:rFonts w:ascii="Cambria Math" w:hAnsi="Cambria Math"/>
+                  </w:rPr>
+                  <m:t>P</m:t>
+                </m:r>
+              </m:e>
+              <m:sub>
+                <m:r>
+                  <w:rPr>
+                    <w:rFonts w:ascii="Cambria Math" w:hAnsi="Cambria Math"/>
+                  </w:rPr>
+                  <m:t>n</m:t>
+                </m:r>
+              </m:sub>
+            </m:sSub>
+          </m:num>
+          <m:den>
+            <m:r>
+              <w:rPr>
+                <w:rFonts w:ascii="Cambria Math" w:hAnsi="Cambria Math"/>
+              </w:rPr>
+              <m:t>∆t</m:t>
+            </m:r>
+          </m:den>
+        </m:f>
+      </m:oMath>
+      <w:r>
+        <w:rPr>
+          <w:rFonts w:eastAsiaTheme="minorEastAsia"/>
+        </w:rPr>
+        <w:t xml:space="preserve"> et </w:t>
+      </w:r>
+      <m:oMath>
+        <m:f>
+          <m:fPr>
+            <m:ctrlPr>
+              <w:rPr>
+                <w:rFonts w:ascii="Cambria Math" w:hAnsi="Cambria Math"/>
+                <w:i/>
+              </w:rPr>
+            </m:ctrlPr>
+          </m:fPr>
+          <m:num>
+            <m:r>
+              <w:rPr>
+                <w:rFonts w:ascii="Cambria Math" w:hAnsi="Cambria Math"/>
+              </w:rPr>
+              <m:t>dP</m:t>
+            </m:r>
+          </m:num>
+          <m:den>
+            <m:r>
+              <w:rPr>
+                <w:rFonts w:ascii="Cambria Math" w:hAnsi="Cambria Math"/>
+              </w:rPr>
+              <m:t>dt</m:t>
+            </m:r>
+          </m:den>
+        </m:f>
+        <m:r>
+          <w:rPr>
+            <w:rFonts w:ascii="Cambria Math" w:hAnsi="Cambria Math"/>
+          </w:rPr>
+          <m:t>=αP(t)</m:t>
+        </m:r>
+      </m:oMath>
+      <w:r>
+        <w:rPr>
+          <w:rFonts w:eastAsiaTheme="minorEastAsia"/>
+        </w:rPr>
+        <w:t xml:space="preserve"> donc </w:t>
+      </w:r>
+      <m:oMath>
+        <m:f>
+          <m:fPr>
+            <m:ctrlPr>
+              <w:rPr>
+                <w:rFonts w:ascii="Cambria Math" w:hAnsi="Cambria Math"/>
+                <w:i/>
+              </w:rPr>
+            </m:ctrlPr>
+          </m:fPr>
+          <m:num>
+            <m:sSub>
+              <m:sSubPr>
+                <m:ctrlPr>
+                  <w:rPr>
+                    <w:rFonts w:ascii="Cambria Math" w:hAnsi="Cambria Math"/>
+                    <w:i/>
+                  </w:rPr>
+                </m:ctrlPr>
+              </m:sSubPr>
+              <m:e>
+                <m:r>
+                  <w:rPr>
+                    <w:rFonts w:ascii="Cambria Math" w:hAnsi="Cambria Math"/>
+                  </w:rPr>
+                  <m:t>P</m:t>
+                </m:r>
+              </m:e>
+              <m:sub>
+                <m:r>
+                  <w:rPr>
+                    <w:rFonts w:ascii="Cambria Math" w:hAnsi="Cambria Math"/>
+                  </w:rPr>
+                  <m:t>n+1</m:t>
+                </m:r>
+              </m:sub>
+            </m:sSub>
+            <m:r>
+              <w:rPr>
+                <w:rFonts w:ascii="Cambria Math" w:hAnsi="Cambria Math"/>
+              </w:rPr>
+              <m:t>-</m:t>
+            </m:r>
+            <m:sSub>
+              <m:sSubPr>
+                <m:ctrlPr>
+                  <w:rPr>
+                    <w:rFonts w:ascii="Cambria Math" w:hAnsi="Cambria Math"/>
+                    <w:i/>
+                  </w:rPr>
+                </m:ctrlPr>
+              </m:sSubPr>
+              <m:e>
+                <m:r>
+                  <w:rPr>
+                    <w:rFonts w:ascii="Cambria Math" w:hAnsi="Cambria Math"/>
+                  </w:rPr>
+                  <m:t>P</m:t>
+                </m:r>
+              </m:e>
+              <m:sub>
+                <m:r>
+                  <w:rPr>
+                    <w:rFonts w:ascii="Cambria Math" w:hAnsi="Cambria Math"/>
+                  </w:rPr>
+                  <m:t>n</m:t>
+                </m:r>
+              </m:sub>
+            </m:sSub>
+          </m:num>
+          <m:den>
+            <m:r>
+              <w:rPr>
+                <w:rFonts w:ascii="Cambria Math" w:hAnsi="Cambria Math"/>
+              </w:rPr>
+              <m:t>∆t</m:t>
+            </m:r>
+          </m:den>
+        </m:f>
+        <m:r>
+          <w:rPr>
+            <w:rFonts w:ascii="Cambria Math" w:hAnsi="Cambria Math"/>
+          </w:rPr>
+          <m:t>=α</m:t>
+        </m:r>
+        <m:sSub>
+          <m:sSubPr>
+            <m:ctrlPr>
+              <w:rPr>
+                <w:rFonts w:ascii="Cambria Math" w:hAnsi="Cambria Math"/>
+                <w:i/>
+              </w:rPr>
+            </m:ctrlPr>
+          </m:sSubPr>
+          <m:e>
+            <m:r>
+              <w:rPr>
+                <w:rFonts w:ascii="Cambria Math" w:hAnsi="Cambria Math"/>
+              </w:rPr>
+              <m:t>P</m:t>
+            </m:r>
+          </m:e>
+          <m:sub>
+            <m:r>
+              <w:rPr>
+                <w:rFonts w:ascii="Cambria Math" w:hAnsi="Cambria Math"/>
+              </w:rPr>
+              <m:t>n</m:t>
+            </m:r>
+          </m:sub>
+        </m:sSub>
+      </m:oMath>
+    </w:p>
+    <w:p>
+      <w:pPr>
+        <w:rPr>
+          <w:rFonts w:eastAsiaTheme="minorEastAsia"/>
+        </w:rPr>
+      </w:pPr>
       <w:r>
         <w:rPr>
           <w:rFonts w:eastAsiaTheme="minorEastAsia"/>
         </w:rPr>
         <w:tab/>
       </w:r>
+      <w:r>
+        <w:rPr>
+          <w:rFonts w:eastAsiaTheme="minorEastAsia"/>
+        </w:rPr>
+        <w:tab/>
+      </w:r>
+      <w:r>
+        <w:rPr>
+          <w:rFonts w:eastAsiaTheme="minorEastAsia"/>
+        </w:rPr>
+        <w:tab/>
+      </w:r>
+      <w:r>
+        <w:rPr>
+          <w:rFonts w:eastAsiaTheme="minorEastAsia"/>
+        </w:rPr>
+        <w:tab/>
+      </w:r>
+      <w:r>
+        <w:rPr>
+          <w:rFonts w:eastAsiaTheme="minorEastAsia"/>
+        </w:rPr>
+        <w:tab/>
+      </w:r>
+      <w:r>
+        <w:rPr>
+          <w:rFonts w:eastAsiaTheme="minorEastAsia"/>
+        </w:rPr>
+        <w:tab/>
+      </w:r>
+      <m:oMath>
+        <m:sSub>
+          <m:sSubPr>
+            <m:ctrlPr>
+              <w:rPr>
+                <w:rFonts w:ascii="Cambria Math" w:hAnsi="Cambria Math"/>
+                <w:i/>
+              </w:rPr>
+            </m:ctrlPr>
+          </m:sSubPr>
+          <m:e>
+            <m:r>
+              <w:rPr>
+                <w:rFonts w:ascii="Cambria Math" w:hAnsi="Cambria Math"/>
+              </w:rPr>
+              <m:t>P</m:t>
+            </m:r>
+          </m:e>
+          <m:sub>
+            <m:r>
+              <w:rPr>
+                <w:rFonts w:ascii="Cambria Math" w:hAnsi="Cambria Math"/>
+              </w:rPr>
+              <m:t>n+1</m:t>
+            </m:r>
+          </m:sub>
+        </m:sSub>
+        <m:r>
+          <w:rPr>
+            <w:rFonts w:ascii="Cambria Math" w:hAnsi="Cambria Math"/>
+          </w:rPr>
+          <m:t>-</m:t>
+        </m:r>
+        <m:sSub>
+          <m:sSubPr>
+            <m:ctrlPr>
+              <w:rPr>
+                <w:rFonts w:ascii="Cambria Math" w:hAnsi="Cambria Math"/>
+                <w:i/>
+              </w:rPr>
+            </m:ctrlPr>
+          </m:sSubPr>
+          <m:e>
+            <m:r>
+              <w:rPr>
+                <w:rFonts w:ascii="Cambria Math" w:hAnsi="Cambria Math"/>
+              </w:rPr>
+              <m:t>P</m:t>
+            </m:r>
+          </m:e>
+          <m:sub>
+            <m:r>
+              <w:rPr>
+                <w:rFonts w:ascii="Cambria Math" w:hAnsi="Cambria Math"/>
+              </w:rPr>
+              <m:t>n</m:t>
+            </m:r>
+          </m:sub>
+        </m:sSub>
+        <m:r>
+          <w:rPr>
+            <w:rFonts w:ascii="Cambria Math" w:hAnsi="Cambria Math"/>
+          </w:rPr>
+          <m:t>=α</m:t>
+        </m:r>
+        <m:sSub>
+          <m:sSubPr>
+            <m:ctrlPr>
+              <w:rPr>
+                <w:rFonts w:ascii="Cambria Math" w:hAnsi="Cambria Math"/>
+                <w:i/>
+              </w:rPr>
+            </m:ctrlPr>
+          </m:sSubPr>
+          <m:e>
+            <m:r>
+              <w:rPr>
+                <w:rFonts w:ascii="Cambria Math" w:hAnsi="Cambria Math"/>
+              </w:rPr>
+              <m:t>P</m:t>
+            </m:r>
+          </m:e>
+          <m:sub>
+            <m:r>
+              <w:rPr>
+                <w:rFonts w:ascii="Cambria Math" w:hAnsi="Cambria Math"/>
+              </w:rPr>
+              <m:t>n</m:t>
+            </m:r>
+          </m:sub>
+        </m:sSub>
+        <m:r>
+          <w:rPr>
+            <w:rFonts w:ascii="Cambria Math" w:hAnsi="Cambria Math"/>
+          </w:rPr>
+          <m:t>*∆t</m:t>
+        </m:r>
+      </m:oMath>
+    </w:p>
+    <w:p>
+      <w:pPr>
+        <w:rPr>
+          <w:rFonts w:eastAsiaTheme="minorEastAsia"/>
+        </w:rPr>
+      </w:pPr>
+      <w:r>
+        <w:rPr>
+          <w:rFonts w:eastAsiaTheme="minorEastAsia"/>
+        </w:rPr>
+        <w:tab/>
+      </w:r>
+      <w:r>
+        <w:rPr>
+          <w:rFonts w:eastAsiaTheme="minorEastAsia"/>
+        </w:rPr>
+        <w:tab/>
+      </w:r>
+      <w:r>
+        <w:rPr>
+          <w:rFonts w:eastAsiaTheme="minorEastAsia"/>
+        </w:rPr>
+        <w:tab/>
+      </w:r>
+      <w:r>
+        <w:rPr>
+          <w:rFonts w:eastAsiaTheme="minorEastAsia"/>
+        </w:rPr>
+        <w:tab/>
+      </w:r>
+      <w:r>
+        <w:rPr>
+          <w:rFonts w:eastAsiaTheme="minorEastAsia"/>
+        </w:rPr>
+        <w:tab/>
+      </w:r>
+      <w:r>
+        <w:rPr>
+          <w:rFonts w:eastAsiaTheme="minorEastAsia"/>
+        </w:rPr>
+        <w:tab/>
+      </w:r>
+      <m:oMath>
+        <m:sSub>
+          <m:sSubPr>
+            <m:ctrlPr>
+              <w:rPr>
+                <w:rFonts w:ascii="Cambria Math" w:hAnsi="Cambria Math"/>
+                <w:i/>
+              </w:rPr>
+            </m:ctrlPr>
+          </m:sSubPr>
+          <m:e>
+            <m:r>
+              <w:rPr>
+                <w:rFonts w:ascii="Cambria Math" w:hAnsi="Cambria Math"/>
+              </w:rPr>
+              <m:t>P</m:t>
+            </m:r>
+          </m:e>
+          <m:sub>
+            <m:r>
+              <w:rPr>
+                <w:rFonts w:ascii="Cambria Math" w:hAnsi="Cambria Math"/>
+              </w:rPr>
+              <m:t>n+1</m:t>
+            </m:r>
+          </m:sub>
+        </m:sSub>
+        <m:r>
+          <w:rPr>
+            <w:rFonts w:ascii="Cambria Math" w:hAnsi="Cambria Math"/>
+          </w:rPr>
+          <m:t>=α</m:t>
+        </m:r>
+        <m:sSub>
+          <m:sSubPr>
+            <m:ctrlPr>
+              <w:rPr>
+                <w:rFonts w:ascii="Cambria Math" w:hAnsi="Cambria Math"/>
+                <w:i/>
+              </w:rPr>
+            </m:ctrlPr>
+          </m:sSubPr>
+          <m:e>
+            <m:r>
+              <w:rPr>
+                <w:rFonts w:ascii="Cambria Math" w:hAnsi="Cambria Math"/>
+              </w:rPr>
+              <m:t>P</m:t>
+            </m:r>
+          </m:e>
+          <m:sub>
+            <m:r>
+              <w:rPr>
+                <w:rFonts w:ascii="Cambria Math" w:hAnsi="Cambria Math"/>
+              </w:rPr>
+              <m:t>n</m:t>
+            </m:r>
+          </m:sub>
+        </m:sSub>
+        <m:r>
+          <w:rPr>
+            <w:rFonts w:ascii="Cambria Math" w:hAnsi="Cambria Math"/>
+          </w:rPr>
+          <m:t>*∆t+</m:t>
+        </m:r>
+        <m:sSub>
+          <m:sSubPr>
+            <m:ctrlPr>
+              <w:rPr>
+                <w:rFonts w:ascii="Cambria Math" w:hAnsi="Cambria Math"/>
+                <w:i/>
+              </w:rPr>
+            </m:ctrlPr>
+          </m:sSubPr>
+          <m:e>
+            <m:r>
+              <w:rPr>
+                <w:rFonts w:ascii="Cambria Math" w:hAnsi="Cambria Math"/>
+              </w:rPr>
+              <m:t>P</m:t>
+            </m:r>
+          </m:e>
+          <m:sub>
+            <m:r>
+              <w:rPr>
+                <w:rFonts w:ascii="Cambria Math" w:hAnsi="Cambria Math"/>
+              </w:rPr>
+              <m:t>n</m:t>
+            </m:r>
+          </m:sub>
+        </m:sSub>
+      </m:oMath>
+    </w:p>
+    <w:p>
+      <w:pPr>
+        <w:rPr>
+          <w:rFonts w:eastAsiaTheme="minorEastAsia"/>
+        </w:rPr>
+      </w:pPr>
+      <w:r>
+        <w:rPr>
+          <w:rFonts w:eastAsiaTheme="minorEastAsia"/>
+        </w:rPr>
+        <w:tab/>
+      </w:r>
+      <w:r>
+        <w:rPr>
+          <w:rFonts w:eastAsiaTheme="minorEastAsia"/>
+        </w:rPr>
+        <w:tab/>
+      </w:r>
+      <w:r>
+        <w:rPr>
+          <w:rFonts w:eastAsiaTheme="minorEastAsia"/>
+        </w:rPr>
+        <w:tab/>
+      </w:r>
+      <w:r>
+        <w:rPr>
+          <w:rFonts w:eastAsiaTheme="minorEastAsia"/>
+        </w:rPr>
+        <w:tab/>
+      </w:r>
+      <w:r>
+        <w:rPr>
+          <w:rFonts w:eastAsiaTheme="minorEastAsia"/>
+        </w:rPr>
+        <w:tab/>
+      </w:r>
+      <w:r>
+        <w:rPr>
+          <w:rFonts w:eastAsiaTheme="minorEastAsia"/>
+        </w:rPr>
+        <w:tab/>
+      </w:r>
+      <m:oMath>
+        <m:sSub>
+          <m:sSubPr>
+            <m:ctrlPr>
+              <w:rPr>
+                <w:rFonts w:ascii="Cambria Math" w:hAnsi="Cambria Math"/>
+                <w:i/>
+              </w:rPr>
+            </m:ctrlPr>
+          </m:sSubPr>
+          <m:e>
+            <m:r>
+              <w:rPr>
+                <w:rFonts w:ascii="Cambria Math" w:hAnsi="Cambria Math"/>
+              </w:rPr>
+              <m:t>P</m:t>
+            </m:r>
+          </m:e>
+          <m:sub>
+            <m:r>
+              <w:rPr>
+                <w:rFonts w:ascii="Cambria Math" w:hAnsi="Cambria Math"/>
+              </w:rPr>
+              <m:t>n+1</m:t>
+            </m:r>
+          </m:sub>
+        </m:sSub>
+        <m:r>
+          <w:rPr>
+            <w:rFonts w:ascii="Cambria Math" w:hAnsi="Cambria Math"/>
+          </w:rPr>
+          <m:t>=</m:t>
+        </m:r>
+        <m:sSub>
+          <m:sSubPr>
+            <m:ctrlPr>
+              <w:rPr>
+                <w:rFonts w:ascii="Cambria Math" w:hAnsi="Cambria Math"/>
+                <w:i/>
+              </w:rPr>
+            </m:ctrlPr>
+          </m:sSubPr>
+          <m:e>
+            <m:r>
+              <w:rPr>
+                <w:rFonts w:ascii="Cambria Math" w:hAnsi="Cambria Math"/>
+              </w:rPr>
+              <m:t>P</m:t>
+            </m:r>
+          </m:e>
+          <m:sub>
+            <m:r>
+              <w:rPr>
+                <w:rFonts w:ascii="Cambria Math" w:hAnsi="Cambria Math"/>
+              </w:rPr>
+              <m:t>n</m:t>
+            </m:r>
+          </m:sub>
+        </m:sSub>
+        <m:r>
+          <w:rPr>
+            <w:rFonts w:ascii="Cambria Math" w:hAnsi="Cambria Math"/>
+          </w:rPr>
+          <m:t>*</m:t>
+        </m:r>
+        <m:r>
+          <w:rPr>
+            <w:rFonts w:ascii="Cambria Math" w:hAnsi="Cambria Math"/>
+          </w:rPr>
+          <m:t>(</m:t>
+        </m:r>
+        <m:r>
+          <w:rPr>
+            <w:rFonts w:ascii="Cambria Math" w:hAnsi="Cambria Math"/>
+          </w:rPr>
+          <m:t>α</m:t>
+        </m:r>
+        <m:r>
+          <w:rPr>
+            <w:rFonts w:ascii="Cambria Math" w:hAnsi="Cambria Math"/>
+          </w:rPr>
+          <m:t>∆t+</m:t>
+        </m:r>
+        <m:r>
+          <w:rPr>
+            <w:rFonts w:ascii="Cambria Math" w:hAnsi="Cambria Math"/>
+          </w:rPr>
+          <m:t>1)</m:t>
+        </m:r>
+      </m:oMath>
+    </w:p>
+    <w:p>
+      <w:pPr>
+        <w:rPr>
+          <w:rFonts w:eastAsiaTheme="minorEastAsia"/>
+        </w:rPr>
+      </w:pPr>
+      <w:r>
+        <w:rPr>
+          <w:rFonts w:eastAsiaTheme="minorEastAsia"/>
+        </w:rPr>
+        <w:t xml:space="preserve">(2) </w:t>
+      </w:r>
+      <w:r>
+        <w:rPr>
+          <w:rFonts w:eastAsiaTheme="minorEastAsia"/>
+        </w:rPr>
+        <w:t xml:space="preserve">On retrouve bien la forme récurrente </w:t>
+      </w:r>
+      <m:oMath>
+        <m:sSub>
+          <m:sSubPr>
+            <m:ctrlPr>
+              <w:rPr>
+                <w:rFonts w:ascii="Cambria Math" w:hAnsi="Cambria Math"/>
+                <w:i/>
+              </w:rPr>
+            </m:ctrlPr>
+          </m:sSubPr>
+          <m:e>
+            <m:r>
+              <w:rPr>
+                <w:rFonts w:ascii="Cambria Math" w:hAnsi="Cambria Math"/>
+              </w:rPr>
+              <m:t>P</m:t>
+            </m:r>
+          </m:e>
+          <m:sub>
+            <m:r>
+              <w:rPr>
+                <w:rFonts w:ascii="Cambria Math" w:hAnsi="Cambria Math"/>
+              </w:rPr>
+              <m:t>n+1</m:t>
+            </m:r>
+          </m:sub>
+        </m:sSub>
+        <m:r>
+          <w:rPr>
+            <w:rFonts w:ascii="Cambria Math" w:hAnsi="Cambria Math"/>
+          </w:rPr>
+          <m:t>=</m:t>
+        </m:r>
+        <m:r>
+          <w:rPr>
+            <w:rFonts w:ascii="Cambria Math" w:hAnsi="Cambria Math"/>
+          </w:rPr>
+          <m:t>a*</m:t>
+        </m:r>
+        <m:sSub>
+          <m:sSubPr>
+            <m:ctrlPr>
+              <w:rPr>
+                <w:rFonts w:ascii="Cambria Math" w:hAnsi="Cambria Math"/>
+                <w:i/>
+              </w:rPr>
+            </m:ctrlPr>
+          </m:sSubPr>
+          <m:e>
+            <m:r>
+              <w:rPr>
+                <w:rFonts w:ascii="Cambria Math" w:hAnsi="Cambria Math"/>
+              </w:rPr>
+              <m:t>P</m:t>
+            </m:r>
+          </m:e>
+          <m:sub>
+            <m:r>
+              <w:rPr>
+                <w:rFonts w:ascii="Cambria Math" w:hAnsi="Cambria Math"/>
+              </w:rPr>
+              <m:t>n</m:t>
+            </m:r>
+          </m:sub>
+        </m:sSub>
+        <m:r>
+          <w:rPr>
+            <w:rFonts w:ascii="Cambria Math" w:hAnsi="Cambria Math"/>
+          </w:rPr>
+          <m:t>+b</m:t>
+        </m:r>
+      </m:oMath>
+      <w:r>
+        <w:rPr>
+          <w:rFonts w:eastAsiaTheme="minorEastAsia"/>
+        </w:rPr>
+        <w:t xml:space="preserve"> avec </w:t>
+      </w:r>
+      <m:oMath>
+        <m:r>
+          <w:rPr>
+            <w:rFonts w:ascii="Cambria Math" w:hAnsi="Cambria Math"/>
+          </w:rPr>
+          <m:t>a</m:t>
+        </m:r>
+        <m:r>
+          <w:rPr>
+            <w:rFonts w:ascii="Cambria Math" w:hAnsi="Cambria Math"/>
+          </w:rPr>
+          <m:t>=(</m:t>
+        </m:r>
+        <m:r>
+          <w:rPr>
+            <w:rFonts w:ascii="Cambria Math" w:hAnsi="Cambria Math"/>
+          </w:rPr>
+          <m:t>α∆t+1</m:t>
+        </m:r>
+        <m:r>
+          <w:rPr>
+            <w:rFonts w:ascii="Cambria Math" w:hAnsi="Cambria Math"/>
+          </w:rPr>
+          <m:t>)</m:t>
+        </m:r>
+      </m:oMath>
+      <w:r>
+        <w:rPr>
+          <w:rFonts w:eastAsiaTheme="minorEastAsia"/>
+        </w:rPr>
+        <w:t xml:space="preserve"> et </w:t>
+      </w:r>
+      <m:oMath>
+        <m:r>
+          <w:rPr>
+            <w:rFonts w:ascii="Cambria Math" w:eastAsiaTheme="minorEastAsia" w:hAnsi="Cambria Math"/>
+          </w:rPr>
+          <m:t>b=0</m:t>
+        </m:r>
+      </m:oMath>
+      <w:r>
+        <w:rPr>
+          <w:rFonts w:eastAsiaTheme="minorEastAsia"/>
+        </w:rPr>
+        <w:t xml:space="preserve">, et en définissant </w:t>
+      </w:r>
+      <m:oMath>
+        <m:r>
+          <w:rPr>
+            <w:rFonts w:ascii="Cambria Math" w:hAnsi="Cambria Math"/>
+          </w:rPr>
+          <m:t>∆t</m:t>
+        </m:r>
+        <m:r>
+          <w:rPr>
+            <w:rFonts w:ascii="Cambria Math" w:hAnsi="Cambria Math"/>
+          </w:rPr>
+          <m:t>=1</m:t>
+        </m:r>
+      </m:oMath>
+      <w:r>
+        <w:rPr>
+          <w:rFonts w:eastAsiaTheme="minorEastAsia"/>
+        </w:rPr>
+        <w:t xml:space="preserve"> donc :</w:t>
+      </w:r>
+    </w:p>
+    <w:p>
+      <w:pPr>
+        <w:rPr>
+          <w:rFonts w:eastAsiaTheme="minorEastAsia"/>
+        </w:rPr>
+      </w:pPr>
+      <w:r>
+        <w:rPr>
+          <w:rFonts w:eastAsiaTheme="minorEastAsia"/>
+        </w:rPr>
+        <w:t xml:space="preserve">(3) </w:t>
+      </w:r>
+      <m:oMath>
+        <m:sSub>
+          <m:sSubPr>
+            <m:ctrlPr>
+              <w:rPr>
+                <w:rFonts w:ascii="Cambria Math" w:hAnsi="Cambria Math"/>
+                <w:i/>
+              </w:rPr>
+            </m:ctrlPr>
+          </m:sSubPr>
+          <m:e>
+            <m:r>
+              <w:rPr>
+                <w:rFonts w:ascii="Cambria Math" w:hAnsi="Cambria Math"/>
+              </w:rPr>
+              <m:t>P</m:t>
+            </m:r>
+          </m:e>
+          <m:sub>
+            <m:r>
+              <w:rPr>
+                <w:rFonts w:ascii="Cambria Math" w:hAnsi="Cambria Math"/>
+              </w:rPr>
+              <m:t>n+1</m:t>
+            </m:r>
+          </m:sub>
+        </m:sSub>
+        <m:r>
+          <w:rPr>
+            <w:rFonts w:ascii="Cambria Math" w:hAnsi="Cambria Math"/>
+          </w:rPr>
+          <m:t>=</m:t>
+        </m:r>
+        <m:sSub>
+          <m:sSubPr>
+            <m:ctrlPr>
+              <w:rPr>
+                <w:rFonts w:ascii="Cambria Math" w:hAnsi="Cambria Math"/>
+                <w:i/>
+              </w:rPr>
+            </m:ctrlPr>
+          </m:sSubPr>
+          <m:e>
+            <m:r>
+              <w:rPr>
+                <w:rFonts w:ascii="Cambria Math" w:hAnsi="Cambria Math"/>
+              </w:rPr>
+              <m:t>P</m:t>
+            </m:r>
+          </m:e>
+          <m:sub>
+            <m:r>
+              <w:rPr>
+                <w:rFonts w:ascii="Cambria Math" w:hAnsi="Cambria Math"/>
+              </w:rPr>
+              <m:t>n</m:t>
+            </m:r>
+          </m:sub>
+        </m:sSub>
+        <m:r>
+          <w:rPr>
+            <w:rFonts w:ascii="Cambria Math" w:hAnsi="Cambria Math"/>
+          </w:rPr>
+          <m:t>*(α∆t+1)</m:t>
+        </m:r>
+      </m:oMath>
+      <w:r>
+        <w:rPr>
+          <w:rFonts w:eastAsiaTheme="minorEastAsia"/>
+        </w:rPr>
+        <w:t xml:space="preserve"> comme r</w:t>
+      </w:r>
+      <m:oMath>
+        <m:r>
+          <w:rPr>
+            <w:rFonts w:ascii="Cambria Math" w:hAnsi="Cambria Math"/>
+          </w:rPr>
+          <m:t>=(α∆t+1)</m:t>
+        </m:r>
+      </m:oMath>
+      <w:r>
+        <w:rPr>
+          <w:rFonts w:eastAsiaTheme="minorEastAsia"/>
+        </w:rPr>
+        <w:t xml:space="preserve"> et  </w:t>
+      </w:r>
+      <m:oMath>
+        <m:sSub>
+          <m:sSubPr>
+            <m:ctrlPr>
+              <w:rPr>
+                <w:rFonts w:ascii="Cambria Math" w:hAnsi="Cambria Math"/>
+                <w:i/>
+              </w:rPr>
+            </m:ctrlPr>
+          </m:sSubPr>
+          <m:e>
+            <m:r>
+              <w:rPr>
+                <w:rFonts w:ascii="Cambria Math" w:hAnsi="Cambria Math"/>
+              </w:rPr>
+              <m:t>P</m:t>
+            </m:r>
+          </m:e>
+          <m:sub>
+            <m:r>
+              <w:rPr>
+                <w:rFonts w:ascii="Cambria Math" w:hAnsi="Cambria Math"/>
+              </w:rPr>
+              <m:t>n</m:t>
+            </m:r>
+          </m:sub>
+        </m:sSub>
+        <m:r>
+          <w:rPr>
+            <w:rFonts w:ascii="Cambria Math" w:hAnsi="Cambria Math"/>
+          </w:rPr>
+          <m:t>=</m:t>
+        </m:r>
+        <m:sSub>
+          <m:sSubPr>
+            <m:ctrlPr>
+              <w:rPr>
+                <w:rFonts w:ascii="Cambria Math" w:hAnsi="Cambria Math"/>
+                <w:i/>
+              </w:rPr>
+            </m:ctrlPr>
+          </m:sSubPr>
+          <m:e>
+            <m:r>
+              <w:rPr>
+                <w:rFonts w:ascii="Cambria Math" w:hAnsi="Cambria Math"/>
+              </w:rPr>
+              <m:t>P</m:t>
+            </m:r>
+          </m:e>
+          <m:sub>
+            <m:r>
+              <w:rPr>
+                <w:rFonts w:ascii="Cambria Math" w:hAnsi="Cambria Math"/>
+              </w:rPr>
+              <m:t>0</m:t>
+            </m:r>
+          </m:sub>
+        </m:sSub>
+        <m:r>
+          <w:rPr>
+            <w:rFonts w:ascii="Cambria Math" w:hAnsi="Cambria Math"/>
+          </w:rPr>
+          <m:t>*</m:t>
+        </m:r>
+        <m:sSup>
+          <m:sSupPr>
+            <m:ctrlPr>
+              <w:rPr>
+                <w:rFonts w:ascii="Cambria Math" w:hAnsi="Cambria Math"/>
+                <w:i/>
+              </w:rPr>
+            </m:ctrlPr>
+          </m:sSupPr>
+          <m:e>
+            <m:r>
+              <w:rPr>
+                <w:rFonts w:ascii="Cambria Math" w:hAnsi="Cambria Math"/>
+              </w:rPr>
+              <m:t>r</m:t>
+            </m:r>
+          </m:e>
+          <m:sup>
+            <m:r>
+              <w:rPr>
+                <w:rFonts w:ascii="Cambria Math" w:hAnsi="Cambria Math"/>
+              </w:rPr>
+              <m:t>n</m:t>
+            </m:r>
+          </m:sup>
+        </m:sSup>
+      </m:oMath>
+      <w:r>
+        <w:rPr>
+          <w:rFonts w:eastAsiaTheme="minorEastAsia"/>
+        </w:rPr>
+        <w:t xml:space="preserve"> alors</w:t>
+      </w:r>
+    </w:p>
+    <w:p>
+      <w:pPr>
+        <w:rPr>
+          <w:rFonts w:eastAsiaTheme="minorEastAsia"/>
+        </w:rPr>
+      </w:pPr>
+      <w:r>
+        <w:rPr>
+          <w:rFonts w:eastAsiaTheme="minorEastAsia"/>
+        </w:rPr>
+        <w:t xml:space="preserve"> </w:t>
+      </w:r>
+      <m:oMath>
+        <m:sSub>
+          <m:sSubPr>
+            <m:ctrlPr>
+              <w:rPr>
+                <w:rFonts w:ascii="Cambria Math" w:hAnsi="Cambria Math"/>
+                <w:i/>
+              </w:rPr>
+            </m:ctrlPr>
+          </m:sSubPr>
+          <m:e>
+            <m:r>
+              <w:rPr>
+                <w:rFonts w:ascii="Cambria Math" w:hAnsi="Cambria Math"/>
+              </w:rPr>
+              <m:t>P</m:t>
+            </m:r>
+          </m:e>
+          <m:sub>
+            <m:r>
+              <w:rPr>
+                <w:rFonts w:ascii="Cambria Math" w:hAnsi="Cambria Math"/>
+              </w:rPr>
+              <m:t>n</m:t>
+            </m:r>
+          </m:sub>
+        </m:sSub>
+        <m:r>
+          <w:rPr>
+            <w:rFonts w:ascii="Cambria Math" w:hAnsi="Cambria Math"/>
+          </w:rPr>
+          <m:t>=</m:t>
+        </m:r>
+        <m:sSub>
+          <m:sSubPr>
+            <m:ctrlPr>
+              <w:rPr>
+                <w:rFonts w:ascii="Cambria Math" w:hAnsi="Cambria Math"/>
+                <w:i/>
+              </w:rPr>
+            </m:ctrlPr>
+          </m:sSubPr>
+          <m:e>
+            <m:r>
+              <w:rPr>
+                <w:rFonts w:ascii="Cambria Math" w:hAnsi="Cambria Math"/>
+              </w:rPr>
+              <m:t>P</m:t>
+            </m:r>
+          </m:e>
+          <m:sub>
+            <m:r>
+              <w:rPr>
+                <w:rFonts w:ascii="Cambria Math" w:hAnsi="Cambria Math"/>
+              </w:rPr>
+              <m:t>0</m:t>
+            </m:r>
+          </m:sub>
+        </m:sSub>
+        <m:r>
+          <w:rPr>
+            <w:rFonts w:ascii="Cambria Math" w:hAnsi="Cambria Math"/>
+          </w:rPr>
+          <m:t>+</m:t>
+        </m:r>
+        <m:sSup>
+          <m:sSupPr>
+            <m:ctrlPr>
+              <w:rPr>
+                <w:rFonts w:ascii="Cambria Math" w:hAnsi="Cambria Math"/>
+                <w:i/>
+              </w:rPr>
+            </m:ctrlPr>
+          </m:sSupPr>
+          <m:e>
+            <m:r>
+              <w:rPr>
+                <w:rFonts w:ascii="Cambria Math" w:hAnsi="Cambria Math"/>
+              </w:rPr>
+              <m:t>(α∆t+1)</m:t>
+            </m:r>
+          </m:e>
+          <m:sup>
+            <m:r>
+              <w:rPr>
+                <w:rFonts w:ascii="Cambria Math" w:hAnsi="Cambria Math"/>
+              </w:rPr>
+              <m:t>n</m:t>
+            </m:r>
+          </m:sup>
+        </m:sSup>
+      </m:oMath>
     </w:p>
     <w:sectPr>
       <w:pgSz w:w="11906" w:h="16838"/>
@@ -3569,6 +4645,7 @@
   <w:style w:type="character" w:default="1" w:styleId="Policepardfaut">
     <w:name w:val="Default Paragraph Font"/>
     <w:uiPriority w:val="1"/>
+    <w:semiHidden/>
     <w:unhideWhenUsed/>
   </w:style>
   <w:style w:type="table" w:default="1" w:styleId="TableauNormal">

</xml_diff>